<commit_message>
Fix right-click on audio voice, add pythonENV_OLD to gitignore
- Right-click context menu works on waveform and mute icons
- WaveformItem stores part_idx for context menu detection
- pythonENV_OLD excluded from git (Python 3.12 env for basic-pitch)

Co-Authored-By: Claude Opus 4.6 (1M context) <noreply@anthropic.com>
</commit_message>
<xml_diff>
--- a/MusiAI.docx
+++ b/MusiAI.docx
@@ -65,12 +65,170 @@
         </w:rPr>
         <w:fldChar w:fldCharType="separate"/>
       </w:r>
-      <w:hyperlink w:anchor="_Toc226857186" w:history="1">
+      <w:hyperlink w:anchor="_Toc226930312" w:history="1">
         <w:r>
           <w:rPr>
             <w:rStyle w:val="Hyperlink"/>
           </w:rPr>
           <w:t>1</w:t>
+        </w:r>
+        <w:r>
+          <w:rPr>
+            <w:rFonts w:asciiTheme="minorHAnsi" w:eastAsiaTheme="minorEastAsia" w:hAnsiTheme="minorHAnsi" w:cstheme="minorBidi"/>
+            <w:kern w:val="2"/>
+            <w:sz w:val="24"/>
+            <w:szCs w:val="24"/>
+            <w:lang w:eastAsia="de-DE" w:bidi="ar-SA"/>
+            <w14:ligatures w14:val="standardContextual"/>
+          </w:rPr>
+          <w:tab/>
+        </w:r>
+        <w:r>
+          <w:rPr>
+            <w:rStyle w:val="Hyperlink"/>
+          </w:rPr>
+          <w:t>Aktuell</w:t>
+        </w:r>
+        <w:r>
+          <w:rPr>
+            <w:webHidden/>
+          </w:rPr>
+          <w:tab/>
+        </w:r>
+        <w:r>
+          <w:rPr>
+            <w:webHidden/>
+          </w:rPr>
+          <w:fldChar w:fldCharType="begin"/>
+        </w:r>
+        <w:r>
+          <w:rPr>
+            <w:webHidden/>
+          </w:rPr>
+          <w:instrText xml:space="preserve"> PAGEREF _Toc226930312 \h </w:instrText>
+        </w:r>
+        <w:r>
+          <w:rPr>
+            <w:webHidden/>
+          </w:rPr>
+        </w:r>
+        <w:r>
+          <w:rPr>
+            <w:webHidden/>
+          </w:rPr>
+          <w:fldChar w:fldCharType="separate"/>
+        </w:r>
+        <w:r>
+          <w:rPr>
+            <w:webHidden/>
+          </w:rPr>
+          <w:t>2</w:t>
+        </w:r>
+        <w:r>
+          <w:rPr>
+            <w:webHidden/>
+          </w:rPr>
+          <w:fldChar w:fldCharType="end"/>
+        </w:r>
+      </w:hyperlink>
+    </w:p>
+    <w:p>
+      <w:pPr>
+        <w:pStyle w:val="Verzeichnis2"/>
+        <w:rPr>
+          <w:rFonts w:asciiTheme="minorHAnsi" w:eastAsiaTheme="minorEastAsia" w:hAnsiTheme="minorHAnsi" w:cstheme="minorBidi"/>
+          <w:kern w:val="2"/>
+          <w:sz w:val="24"/>
+          <w:szCs w:val="24"/>
+          <w:lang w:eastAsia="de-DE" w:bidi="ar-SA"/>
+          <w14:ligatures w14:val="standardContextual"/>
+        </w:rPr>
+      </w:pPr>
+      <w:hyperlink w:anchor="_Toc226930313" w:history="1">
+        <w:r>
+          <w:rPr>
+            <w:rStyle w:val="Hyperlink"/>
+          </w:rPr>
+          <w:t>1.1</w:t>
+        </w:r>
+        <w:r>
+          <w:rPr>
+            <w:rFonts w:asciiTheme="minorHAnsi" w:eastAsiaTheme="minorEastAsia" w:hAnsiTheme="minorHAnsi" w:cstheme="minorBidi"/>
+            <w:kern w:val="2"/>
+            <w:sz w:val="24"/>
+            <w:szCs w:val="24"/>
+            <w:lang w:eastAsia="de-DE" w:bidi="ar-SA"/>
+            <w14:ligatures w14:val="standardContextual"/>
+          </w:rPr>
+          <w:tab/>
+        </w:r>
+        <w:r>
+          <w:rPr>
+            <w:rStyle w:val="Hyperlink"/>
+          </w:rPr>
+          <w:t>Versionen</w:t>
+        </w:r>
+        <w:r>
+          <w:rPr>
+            <w:webHidden/>
+          </w:rPr>
+          <w:tab/>
+        </w:r>
+        <w:r>
+          <w:rPr>
+            <w:webHidden/>
+          </w:rPr>
+          <w:fldChar w:fldCharType="begin"/>
+        </w:r>
+        <w:r>
+          <w:rPr>
+            <w:webHidden/>
+          </w:rPr>
+          <w:instrText xml:space="preserve"> PAGEREF _Toc226930313 \h </w:instrText>
+        </w:r>
+        <w:r>
+          <w:rPr>
+            <w:webHidden/>
+          </w:rPr>
+        </w:r>
+        <w:r>
+          <w:rPr>
+            <w:webHidden/>
+          </w:rPr>
+          <w:fldChar w:fldCharType="separate"/>
+        </w:r>
+        <w:r>
+          <w:rPr>
+            <w:webHidden/>
+          </w:rPr>
+          <w:t>2</w:t>
+        </w:r>
+        <w:r>
+          <w:rPr>
+            <w:webHidden/>
+          </w:rPr>
+          <w:fldChar w:fldCharType="end"/>
+        </w:r>
+      </w:hyperlink>
+    </w:p>
+    <w:p>
+      <w:pPr>
+        <w:pStyle w:val="Verzeichnis1"/>
+        <w:rPr>
+          <w:rFonts w:asciiTheme="minorHAnsi" w:eastAsiaTheme="minorEastAsia" w:hAnsiTheme="minorHAnsi" w:cstheme="minorBidi"/>
+          <w:kern w:val="2"/>
+          <w:sz w:val="24"/>
+          <w:szCs w:val="24"/>
+          <w:lang w:eastAsia="de-DE" w:bidi="ar-SA"/>
+          <w14:ligatures w14:val="standardContextual"/>
+        </w:rPr>
+      </w:pPr>
+      <w:hyperlink w:anchor="_Toc226930314" w:history="1">
+        <w:r>
+          <w:rPr>
+            <w:rStyle w:val="Hyperlink"/>
+          </w:rPr>
+          <w:t>2</w:t>
         </w:r>
         <w:r>
           <w:rPr>
@@ -105,7 +263,7 @@
           <w:rPr>
             <w:webHidden/>
           </w:rPr>
-          <w:instrText xml:space="preserve"> PAGEREF _Toc226857186 \h </w:instrText>
+          <w:instrText xml:space="preserve"> PAGEREF _Toc226930314 \h </w:instrText>
         </w:r>
         <w:r>
           <w:rPr>
@@ -122,7 +280,7 @@
           <w:rPr>
             <w:webHidden/>
           </w:rPr>
-          <w:t>2</w:t>
+          <w:t>3</w:t>
         </w:r>
         <w:r>
           <w:rPr>
@@ -144,12 +302,12 @@
           <w14:ligatures w14:val="standardContextual"/>
         </w:rPr>
       </w:pPr>
-      <w:hyperlink w:anchor="_Toc226857187" w:history="1">
+      <w:hyperlink w:anchor="_Toc226930315" w:history="1">
         <w:r>
           <w:rPr>
             <w:rStyle w:val="Hyperlink"/>
           </w:rPr>
-          <w:t>1.1</w:t>
+          <w:t>2.1</w:t>
         </w:r>
         <w:r>
           <w:rPr>
@@ -184,7 +342,7 @@
           <w:rPr>
             <w:webHidden/>
           </w:rPr>
-          <w:instrText xml:space="preserve"> PAGEREF _Toc226857187 \h </w:instrText>
+          <w:instrText xml:space="preserve"> PAGEREF _Toc226930315 \h </w:instrText>
         </w:r>
         <w:r>
           <w:rPr>
@@ -201,7 +359,7 @@
           <w:rPr>
             <w:webHidden/>
           </w:rPr>
-          <w:t>3</w:t>
+          <w:t>4</w:t>
         </w:r>
         <w:r>
           <w:rPr>
@@ -223,12 +381,12 @@
           <w14:ligatures w14:val="standardContextual"/>
         </w:rPr>
       </w:pPr>
-      <w:hyperlink w:anchor="_Toc226857188" w:history="1">
+      <w:hyperlink w:anchor="_Toc226930316" w:history="1">
         <w:r>
           <w:rPr>
             <w:rStyle w:val="Hyperlink"/>
           </w:rPr>
-          <w:t>1.2</w:t>
+          <w:t>2.2</w:t>
         </w:r>
         <w:r>
           <w:rPr>
@@ -263,7 +421,7 @@
           <w:rPr>
             <w:webHidden/>
           </w:rPr>
-          <w:instrText xml:space="preserve"> PAGEREF _Toc226857188 \h </w:instrText>
+          <w:instrText xml:space="preserve"> PAGEREF _Toc226930316 \h </w:instrText>
         </w:r>
         <w:r>
           <w:rPr>
@@ -280,7 +438,7 @@
           <w:rPr>
             <w:webHidden/>
           </w:rPr>
-          <w:t>6</w:t>
+          <w:t>7</w:t>
         </w:r>
         <w:r>
           <w:rPr>
@@ -302,12 +460,12 @@
           <w14:ligatures w14:val="standardContextual"/>
         </w:rPr>
       </w:pPr>
-      <w:hyperlink w:anchor="_Toc226857189" w:history="1">
+      <w:hyperlink w:anchor="_Toc226930317" w:history="1">
         <w:r>
           <w:rPr>
             <w:rStyle w:val="Hyperlink"/>
           </w:rPr>
-          <w:t>1.3</w:t>
+          <w:t>2.3</w:t>
         </w:r>
         <w:r>
           <w:rPr>
@@ -342,7 +500,7 @@
           <w:rPr>
             <w:webHidden/>
           </w:rPr>
-          <w:instrText xml:space="preserve"> PAGEREF _Toc226857189 \h </w:instrText>
+          <w:instrText xml:space="preserve"> PAGEREF _Toc226930317 \h </w:instrText>
         </w:r>
         <w:r>
           <w:rPr>
@@ -359,7 +517,7 @@
           <w:rPr>
             <w:webHidden/>
           </w:rPr>
-          <w:t>13</w:t>
+          <w:t>14</w:t>
         </w:r>
         <w:r>
           <w:rPr>
@@ -381,12 +539,170 @@
           <w14:ligatures w14:val="standardContextual"/>
         </w:rPr>
       </w:pPr>
-      <w:hyperlink w:anchor="_Toc226857190" w:history="1">
+      <w:hyperlink w:anchor="_Toc226930318" w:history="1">
         <w:r>
           <w:rPr>
             <w:rStyle w:val="Hyperlink"/>
           </w:rPr>
-          <w:t>2</w:t>
+          <w:t>3</w:t>
+        </w:r>
+        <w:r>
+          <w:rPr>
+            <w:rFonts w:asciiTheme="minorHAnsi" w:eastAsiaTheme="minorEastAsia" w:hAnsiTheme="minorHAnsi" w:cstheme="minorBidi"/>
+            <w:kern w:val="2"/>
+            <w:sz w:val="24"/>
+            <w:szCs w:val="24"/>
+            <w:lang w:eastAsia="de-DE" w:bidi="ar-SA"/>
+            <w14:ligatures w14:val="standardContextual"/>
+          </w:rPr>
+          <w:tab/>
+        </w:r>
+        <w:r>
+          <w:rPr>
+            <w:rStyle w:val="Hyperlink"/>
+          </w:rPr>
+          <w:t>Architektur</w:t>
+        </w:r>
+        <w:r>
+          <w:rPr>
+            <w:webHidden/>
+          </w:rPr>
+          <w:tab/>
+        </w:r>
+        <w:r>
+          <w:rPr>
+            <w:webHidden/>
+          </w:rPr>
+          <w:fldChar w:fldCharType="begin"/>
+        </w:r>
+        <w:r>
+          <w:rPr>
+            <w:webHidden/>
+          </w:rPr>
+          <w:instrText xml:space="preserve"> PAGEREF _Toc226930318 \h </w:instrText>
+        </w:r>
+        <w:r>
+          <w:rPr>
+            <w:webHidden/>
+          </w:rPr>
+        </w:r>
+        <w:r>
+          <w:rPr>
+            <w:webHidden/>
+          </w:rPr>
+          <w:fldChar w:fldCharType="separate"/>
+        </w:r>
+        <w:r>
+          <w:rPr>
+            <w:webHidden/>
+          </w:rPr>
+          <w:t>20</w:t>
+        </w:r>
+        <w:r>
+          <w:rPr>
+            <w:webHidden/>
+          </w:rPr>
+          <w:fldChar w:fldCharType="end"/>
+        </w:r>
+      </w:hyperlink>
+    </w:p>
+    <w:p>
+      <w:pPr>
+        <w:pStyle w:val="Verzeichnis2"/>
+        <w:rPr>
+          <w:rFonts w:asciiTheme="minorHAnsi" w:eastAsiaTheme="minorEastAsia" w:hAnsiTheme="minorHAnsi" w:cstheme="minorBidi"/>
+          <w:kern w:val="2"/>
+          <w:sz w:val="24"/>
+          <w:szCs w:val="24"/>
+          <w:lang w:eastAsia="de-DE" w:bidi="ar-SA"/>
+          <w14:ligatures w14:val="standardContextual"/>
+        </w:rPr>
+      </w:pPr>
+      <w:hyperlink w:anchor="_Toc226930319" w:history="1">
+        <w:r>
+          <w:rPr>
+            <w:rStyle w:val="Hyperlink"/>
+          </w:rPr>
+          <w:t>3.1</w:t>
+        </w:r>
+        <w:r>
+          <w:rPr>
+            <w:rFonts w:asciiTheme="minorHAnsi" w:eastAsiaTheme="minorEastAsia" w:hAnsiTheme="minorHAnsi" w:cstheme="minorBidi"/>
+            <w:kern w:val="2"/>
+            <w:sz w:val="24"/>
+            <w:szCs w:val="24"/>
+            <w:lang w:eastAsia="de-DE" w:bidi="ar-SA"/>
+            <w14:ligatures w14:val="standardContextual"/>
+          </w:rPr>
+          <w:tab/>
+        </w:r>
+        <w:r>
+          <w:rPr>
+            <w:rStyle w:val="Hyperlink"/>
+          </w:rPr>
+          <w:t>Sounds</w:t>
+        </w:r>
+        <w:r>
+          <w:rPr>
+            <w:webHidden/>
+          </w:rPr>
+          <w:tab/>
+        </w:r>
+        <w:r>
+          <w:rPr>
+            <w:webHidden/>
+          </w:rPr>
+          <w:fldChar w:fldCharType="begin"/>
+        </w:r>
+        <w:r>
+          <w:rPr>
+            <w:webHidden/>
+          </w:rPr>
+          <w:instrText xml:space="preserve"> PAGEREF _Toc226930319 \h </w:instrText>
+        </w:r>
+        <w:r>
+          <w:rPr>
+            <w:webHidden/>
+          </w:rPr>
+        </w:r>
+        <w:r>
+          <w:rPr>
+            <w:webHidden/>
+          </w:rPr>
+          <w:fldChar w:fldCharType="separate"/>
+        </w:r>
+        <w:r>
+          <w:rPr>
+            <w:webHidden/>
+          </w:rPr>
+          <w:t>20</w:t>
+        </w:r>
+        <w:r>
+          <w:rPr>
+            <w:webHidden/>
+          </w:rPr>
+          <w:fldChar w:fldCharType="end"/>
+        </w:r>
+      </w:hyperlink>
+    </w:p>
+    <w:p>
+      <w:pPr>
+        <w:pStyle w:val="Verzeichnis1"/>
+        <w:rPr>
+          <w:rFonts w:asciiTheme="minorHAnsi" w:eastAsiaTheme="minorEastAsia" w:hAnsiTheme="minorHAnsi" w:cstheme="minorBidi"/>
+          <w:kern w:val="2"/>
+          <w:sz w:val="24"/>
+          <w:szCs w:val="24"/>
+          <w:lang w:eastAsia="de-DE" w:bidi="ar-SA"/>
+          <w14:ligatures w14:val="standardContextual"/>
+        </w:rPr>
+      </w:pPr>
+      <w:hyperlink w:anchor="_Toc226930320" w:history="1">
+        <w:r>
+          <w:rPr>
+            <w:rStyle w:val="Hyperlink"/>
+          </w:rPr>
+          <w:t>4</w:t>
         </w:r>
         <w:r>
           <w:rPr>
@@ -421,7 +737,7 @@
           <w:rPr>
             <w:webHidden/>
           </w:rPr>
-          <w:instrText xml:space="preserve"> PAGEREF _Toc226857190 \h </w:instrText>
+          <w:instrText xml:space="preserve"> PAGEREF _Toc226930320 \h </w:instrText>
         </w:r>
         <w:r>
           <w:rPr>
@@ -438,7 +754,7 @@
           <w:rPr>
             <w:webHidden/>
           </w:rPr>
-          <w:t>18</w:t>
+          <w:t>21</w:t>
         </w:r>
         <w:r>
           <w:rPr>
@@ -483,12 +799,116 @@
       <w:pPr>
         <w:pStyle w:val="berschrift1"/>
       </w:pPr>
-      <w:bookmarkStart w:id="0" w:name="_Toc226857186"/>
+      <w:bookmarkStart w:id="0" w:name="_Toc226930312"/>
+      <w:r>
+        <w:lastRenderedPageBreak/>
+        <w:t>Aktuell</w:t>
+      </w:r>
+      <w:bookmarkEnd w:id="0"/>
+    </w:p>
+    <w:p>
+      <w:pPr>
+        <w:pStyle w:val="berschrift2"/>
+      </w:pPr>
+      <w:bookmarkStart w:id="1" w:name="_Toc226930313"/>
+      <w:r>
+        <w:t>Versionen</w:t>
+      </w:r>
+      <w:bookmarkEnd w:id="1"/>
+    </w:p>
+    <w:p>
+      <w:pPr>
+        <w:pStyle w:val="Textkrper"/>
+        <w:ind w:left="0"/>
+      </w:pPr>
+      <w:r>
+        <w:t>0.12</w:t>
+      </w:r>
+    </w:p>
+    <w:p>
+      <w:pPr>
+        <w:pStyle w:val="Textkrper"/>
+        <w:ind w:left="0"/>
+      </w:pPr>
+    </w:p>
+    <w:p>
+      <w:pPr>
+        <w:pStyle w:val="Textkrper"/>
+        <w:ind w:left="0"/>
+      </w:pPr>
+    </w:p>
+    <w:p>
+      <w:pPr>
+        <w:pStyle w:val="Textkrper"/>
+        <w:ind w:left="0"/>
+      </w:pPr>
+      <w:r>
+        <w:t>0.11</w:t>
+      </w:r>
+    </w:p>
+    <w:p>
+      <w:pPr>
+        <w:pStyle w:val="Textkrper"/>
+        <w:ind w:left="0"/>
+      </w:pPr>
+      <w:r>
+        <w:t>Notenerkennung</w:t>
+      </w:r>
+    </w:p>
+    <w:p>
+      <w:pPr>
+        <w:pStyle w:val="Textkrper"/>
+        <w:ind w:left="0"/>
+      </w:pPr>
+    </w:p>
+    <w:p>
+      <w:pPr>
+        <w:pStyle w:val="Textkrper"/>
+        <w:ind w:left="0"/>
+      </w:pPr>
+      <w:r>
+        <w:t>Instrumente</w:t>
+      </w:r>
+    </w:p>
+    <w:p>
+      <w:pPr>
+        <w:pStyle w:val="Textkrper"/>
+        <w:ind w:left="0"/>
+      </w:pPr>
+      <w:r>
+        <w:t>N</w:t>
+      </w:r>
+      <w:r>
+        <w:t>eue Stimme – Aufnahme.</w:t>
+      </w:r>
+    </w:p>
+    <w:p>
+      <w:pPr>
+        <w:pStyle w:val="Textkrper"/>
+      </w:pPr>
+      <w:r>
+        <w:t>│</w:t>
+      </w:r>
+    </w:p>
+    <w:p>
+      <w:pPr>
+        <w:pStyle w:val="Textkrper"/>
+        <w:ind w:left="0"/>
+      </w:pPr>
+      <w:r>
+        <w:t xml:space="preserve">  └────────────────────────────┴────────────┴─────────────────────────────────────────┴─────────────────────────────┘</w:t>
+      </w:r>
+    </w:p>
+    <w:p>
+      <w:pPr>
+        <w:pStyle w:val="berschrift1"/>
+      </w:pPr>
+      <w:bookmarkStart w:id="2" w:name="_Toc226930314"/>
       <w:r>
         <w:lastRenderedPageBreak/>
         <w:t>Prompt</w:t>
       </w:r>
-      <w:bookmarkEnd w:id="0"/>
+      <w:bookmarkEnd w:id="2"/>
     </w:p>
     <w:p>
       <w:r>
@@ -514,18 +934,13 @@
         <w:t xml:space="preserve"> </w:t>
       </w:r>
       <w:r>
-        <w:t xml:space="preserve">tempo ganz genau definieren kann? so wie bei einer </w:t>
-      </w:r>
-      <w:proofErr w:type="gramStart"/>
-      <w:r>
-        <w:t xml:space="preserve">live </w:t>
+        <w:t xml:space="preserve">tempo ganz genau definieren kann? so wie bei einer live </w:t>
       </w:r>
       <w:proofErr w:type="spellStart"/>
       <w:r>
         <w:t>performance</w:t>
       </w:r>
       <w:proofErr w:type="spellEnd"/>
-      <w:proofErr w:type="gramEnd"/>
       <w:r>
         <w:t>?</w:t>
       </w:r>
@@ -1240,35 +1655,7 @@
         <w:rPr>
           <w:rFonts w:cs="Arial"/>
         </w:rPr>
-        <w:t xml:space="preserve">  │ Audio (WAV/</w:t>
-      </w:r>
-      <w:proofErr w:type="gramStart"/>
-      <w:r>
-        <w:rPr>
-          <w:rFonts w:cs="Arial"/>
-        </w:rPr>
-        <w:t xml:space="preserve">FLAC)   </w:t>
-      </w:r>
-      <w:proofErr w:type="gramEnd"/>
-      <w:r>
-        <w:rPr>
-          <w:rFonts w:cs="Arial"/>
-        </w:rPr>
-        <w:t xml:space="preserve">      │ </w:t>
-      </w:r>
-      <w:proofErr w:type="gramStart"/>
-      <w:r>
-        <w:rPr>
-          <w:rFonts w:cs="Arial"/>
-        </w:rPr>
-        <w:t>Erfasst</w:t>
-      </w:r>
-      <w:proofErr w:type="gramEnd"/>
-      <w:r>
-        <w:rPr>
-          <w:rFonts w:cs="Arial"/>
-        </w:rPr>
-        <w:t xml:space="preserve"> alles 1:1, aber nicht editierbar wie MIDI    │</w:t>
+        <w:t xml:space="preserve">  │ Audio (WAV/FLAC)         │ Erfasst alles 1:1, aber nicht editierbar wie MIDI    │</w:t>
       </w:r>
     </w:p>
     <w:p>
@@ -1407,21 +1794,7 @@
         <w:rPr>
           <w:rFonts w:cs="Arial"/>
         </w:rPr>
-        <w:t xml:space="preserve">  </w:t>
-      </w:r>
-      <w:proofErr w:type="gramStart"/>
-      <w:r>
-        <w:rPr>
-          <w:rFonts w:cs="Arial"/>
-        </w:rPr>
-        <w:t>Arbeitest</w:t>
-      </w:r>
-      <w:proofErr w:type="gramEnd"/>
-      <w:r>
-        <w:rPr>
-          <w:rFonts w:cs="Arial"/>
-        </w:rPr>
-        <w:t xml:space="preserve"> du an einem konkreten Projekt, bei dem du sowas einbauen möchtest?</w:t>
+        <w:t xml:space="preserve">  Arbeitest du an einem konkreten Projekt, bei dem du sowas einbauen möchtest?</w:t>
       </w:r>
     </w:p>
     <w:p>
@@ -1446,7 +1819,7 @@
       <w:pPr>
         <w:pStyle w:val="berschrift2"/>
       </w:pPr>
-      <w:bookmarkStart w:id="1" w:name="_Toc226857187"/>
+      <w:bookmarkStart w:id="3" w:name="_Toc226930315"/>
       <w:r>
         <w:t xml:space="preserve">Alter in </w:t>
       </w:r>
@@ -1454,7 +1827,7 @@
       <w:r>
         <w:t>MusicXML</w:t>
       </w:r>
-      <w:bookmarkEnd w:id="1"/>
+      <w:bookmarkEnd w:id="3"/>
       <w:proofErr w:type="spellEnd"/>
     </w:p>
     <w:p>
@@ -1563,21 +1936,7 @@
         <w:rPr>
           <w:rFonts w:cs="Arial"/>
         </w:rPr>
-        <w:t xml:space="preserve">  </w:t>
-      </w:r>
-      <w:proofErr w:type="gramStart"/>
-      <w:r>
-        <w:rPr>
-          <w:rFonts w:cs="Arial"/>
-        </w:rPr>
-        <w:t>&lt;!--</w:t>
-      </w:r>
-      <w:proofErr w:type="gramEnd"/>
-      <w:r>
-        <w:rPr>
-          <w:rFonts w:cs="Arial"/>
-        </w:rPr>
-        <w:t xml:space="preserve"> Normales C4 --&gt;</w:t>
+        <w:t xml:space="preserve">  &lt;!-- Normales C4 --&gt;</w:t>
       </w:r>
     </w:p>
     <w:p>
@@ -1733,78 +2092,847 @@
         <w:rPr>
           <w:rFonts w:cs="Arial"/>
         </w:rPr>
+        <w:t xml:space="preserve">  &lt;!-- C4, 4 Cent höher (4% eines Halbtons) --&gt;</w:t>
+      </w:r>
+    </w:p>
+    <w:p>
+      <w:pPr>
+        <w:pStyle w:val="Textkrper2"/>
+        <w:ind w:left="0"/>
+        <w:rPr>
+          <w:rFonts w:cs="Arial"/>
+        </w:rPr>
+      </w:pPr>
+      <w:r>
+        <w:rPr>
+          <w:rFonts w:cs="Arial"/>
+        </w:rPr>
+        <w:t xml:space="preserve">  &lt;pitch&gt;</w:t>
+      </w:r>
+    </w:p>
+    <w:p>
+      <w:pPr>
+        <w:pStyle w:val="Textkrper2"/>
+        <w:ind w:left="0"/>
+        <w:rPr>
+          <w:rFonts w:cs="Arial"/>
+        </w:rPr>
+      </w:pPr>
+      <w:r>
+        <w:rPr>
+          <w:rFonts w:cs="Arial"/>
+        </w:rPr>
+        <w:t xml:space="preserve">    &lt;</w:t>
+      </w:r>
+      <w:proofErr w:type="spellStart"/>
+      <w:r>
+        <w:rPr>
+          <w:rFonts w:cs="Arial"/>
+        </w:rPr>
+        <w:t>step</w:t>
+      </w:r>
+      <w:proofErr w:type="spellEnd"/>
+      <w:r>
+        <w:rPr>
+          <w:rFonts w:cs="Arial"/>
+        </w:rPr>
+        <w:t>&gt;C&lt;/</w:t>
+      </w:r>
+      <w:proofErr w:type="spellStart"/>
+      <w:r>
+        <w:rPr>
+          <w:rFonts w:cs="Arial"/>
+        </w:rPr>
+        <w:t>step</w:t>
+      </w:r>
+      <w:proofErr w:type="spellEnd"/>
+      <w:r>
+        <w:rPr>
+          <w:rFonts w:cs="Arial"/>
+        </w:rPr>
+        <w:t>&gt;</w:t>
+      </w:r>
+    </w:p>
+    <w:p>
+      <w:pPr>
+        <w:pStyle w:val="Textkrper2"/>
+        <w:ind w:left="0"/>
+        <w:rPr>
+          <w:rFonts w:cs="Arial"/>
+        </w:rPr>
+      </w:pPr>
+      <w:r>
+        <w:rPr>
+          <w:rFonts w:cs="Arial"/>
+        </w:rPr>
+        <w:t xml:space="preserve">    &lt;alter&gt;0.04&lt;/alter&gt;       &lt;!-- 0.04 Halbtöne = 4 Cent --&gt;</w:t>
+      </w:r>
+    </w:p>
+    <w:p>
+      <w:pPr>
+        <w:pStyle w:val="Textkrper2"/>
+        <w:ind w:left="0"/>
+        <w:rPr>
+          <w:rFonts w:cs="Arial"/>
+        </w:rPr>
+      </w:pPr>
+      <w:r>
+        <w:rPr>
+          <w:rFonts w:cs="Arial"/>
+        </w:rPr>
+        <w:t xml:space="preserve">    &lt;</w:t>
+      </w:r>
+      <w:proofErr w:type="spellStart"/>
+      <w:r>
+        <w:rPr>
+          <w:rFonts w:cs="Arial"/>
+        </w:rPr>
+        <w:t>octave</w:t>
+      </w:r>
+      <w:proofErr w:type="spellEnd"/>
+      <w:r>
+        <w:rPr>
+          <w:rFonts w:cs="Arial"/>
+        </w:rPr>
+        <w:t>&gt;4&lt;/</w:t>
+      </w:r>
+      <w:proofErr w:type="spellStart"/>
+      <w:r>
+        <w:rPr>
+          <w:rFonts w:cs="Arial"/>
+        </w:rPr>
+        <w:t>octave</w:t>
+      </w:r>
+      <w:proofErr w:type="spellEnd"/>
+      <w:r>
+        <w:rPr>
+          <w:rFonts w:cs="Arial"/>
+        </w:rPr>
+        <w:t>&gt;</w:t>
+      </w:r>
+    </w:p>
+    <w:p>
+      <w:pPr>
+        <w:pStyle w:val="Textkrper2"/>
+        <w:ind w:left="0"/>
+        <w:rPr>
+          <w:rFonts w:cs="Arial"/>
+        </w:rPr>
+      </w:pPr>
+      <w:r>
+        <w:rPr>
+          <w:rFonts w:cs="Arial"/>
+        </w:rPr>
+        <w:t xml:space="preserve">  &lt;/pitch&gt;</w:t>
+      </w:r>
+    </w:p>
+    <w:p>
+      <w:pPr>
+        <w:pStyle w:val="Textkrper2"/>
+        <w:ind w:left="0"/>
+        <w:rPr>
+          <w:rFonts w:cs="Arial"/>
+        </w:rPr>
+      </w:pPr>
+    </w:p>
+    <w:p>
+      <w:pPr>
+        <w:pStyle w:val="Textkrper2"/>
+        <w:ind w:left="0"/>
+        <w:rPr>
+          <w:rFonts w:cs="Arial"/>
+        </w:rPr>
+      </w:pPr>
+      <w:r>
+        <w:rPr>
+          <w:rFonts w:cs="Arial"/>
+        </w:rPr>
+        <w:t xml:space="preserve">  &lt;!-- C4, 40 Cent höher (fast ein Viertelton) --&gt;</w:t>
+      </w:r>
+    </w:p>
+    <w:p>
+      <w:pPr>
+        <w:pStyle w:val="Textkrper2"/>
+        <w:ind w:left="0"/>
+        <w:rPr>
+          <w:rFonts w:cs="Arial"/>
+        </w:rPr>
+      </w:pPr>
+      <w:r>
+        <w:rPr>
+          <w:rFonts w:cs="Arial"/>
+        </w:rPr>
+        <w:t xml:space="preserve">  &lt;pitch&gt;</w:t>
+      </w:r>
+    </w:p>
+    <w:p>
+      <w:pPr>
+        <w:pStyle w:val="Textkrper2"/>
+        <w:ind w:left="0"/>
+        <w:rPr>
+          <w:rFonts w:cs="Arial"/>
+        </w:rPr>
+      </w:pPr>
+      <w:r>
+        <w:rPr>
+          <w:rFonts w:cs="Arial"/>
+        </w:rPr>
+        <w:t xml:space="preserve">    &lt;</w:t>
+      </w:r>
+      <w:proofErr w:type="spellStart"/>
+      <w:r>
+        <w:rPr>
+          <w:rFonts w:cs="Arial"/>
+        </w:rPr>
+        <w:t>step</w:t>
+      </w:r>
+      <w:proofErr w:type="spellEnd"/>
+      <w:r>
+        <w:rPr>
+          <w:rFonts w:cs="Arial"/>
+        </w:rPr>
+        <w:t>&gt;C&lt;/</w:t>
+      </w:r>
+      <w:proofErr w:type="spellStart"/>
+      <w:r>
+        <w:rPr>
+          <w:rFonts w:cs="Arial"/>
+        </w:rPr>
+        <w:t>step</w:t>
+      </w:r>
+      <w:proofErr w:type="spellEnd"/>
+      <w:r>
+        <w:rPr>
+          <w:rFonts w:cs="Arial"/>
+        </w:rPr>
+        <w:t>&gt;</w:t>
+      </w:r>
+    </w:p>
+    <w:p>
+      <w:pPr>
+        <w:pStyle w:val="Textkrper2"/>
+        <w:ind w:left="0"/>
+        <w:rPr>
+          <w:rFonts w:cs="Arial"/>
+        </w:rPr>
+      </w:pPr>
+      <w:r>
+        <w:rPr>
+          <w:rFonts w:cs="Arial"/>
+        </w:rPr>
+        <w:t xml:space="preserve">    &lt;alter&gt;0.40&lt;/alter&gt;</w:t>
+      </w:r>
+    </w:p>
+    <w:p>
+      <w:pPr>
+        <w:pStyle w:val="Textkrper2"/>
+        <w:ind w:left="0"/>
+        <w:rPr>
+          <w:rFonts w:cs="Arial"/>
+        </w:rPr>
+      </w:pPr>
+      <w:r>
+        <w:rPr>
+          <w:rFonts w:cs="Arial"/>
+        </w:rPr>
+        <w:t xml:space="preserve">    &lt;</w:t>
+      </w:r>
+      <w:proofErr w:type="spellStart"/>
+      <w:r>
+        <w:rPr>
+          <w:rFonts w:cs="Arial"/>
+        </w:rPr>
+        <w:t>octave</w:t>
+      </w:r>
+      <w:proofErr w:type="spellEnd"/>
+      <w:r>
+        <w:rPr>
+          <w:rFonts w:cs="Arial"/>
+        </w:rPr>
+        <w:t>&gt;4&lt;/</w:t>
+      </w:r>
+      <w:proofErr w:type="spellStart"/>
+      <w:r>
+        <w:rPr>
+          <w:rFonts w:cs="Arial"/>
+        </w:rPr>
+        <w:t>octave</w:t>
+      </w:r>
+      <w:proofErr w:type="spellEnd"/>
+      <w:r>
+        <w:rPr>
+          <w:rFonts w:cs="Arial"/>
+        </w:rPr>
+        <w:t>&gt;</w:t>
+      </w:r>
+    </w:p>
+    <w:p>
+      <w:pPr>
+        <w:pStyle w:val="Textkrper2"/>
+        <w:ind w:left="0"/>
+        <w:rPr>
+          <w:rFonts w:cs="Arial"/>
+        </w:rPr>
+      </w:pPr>
+      <w:r>
+        <w:rPr>
+          <w:rFonts w:cs="Arial"/>
+        </w:rPr>
+        <w:t xml:space="preserve">  &lt;/pitch&gt;</w:t>
+      </w:r>
+    </w:p>
+    <w:p>
+      <w:pPr>
+        <w:pStyle w:val="Textkrper2"/>
+        <w:ind w:left="0"/>
+        <w:rPr>
+          <w:rFonts w:cs="Arial"/>
+        </w:rPr>
+      </w:pPr>
+    </w:p>
+    <w:p>
+      <w:pPr>
+        <w:pStyle w:val="Textkrper2"/>
+        <w:ind w:left="0"/>
+        <w:rPr>
+          <w:rFonts w:cs="Arial"/>
+        </w:rPr>
+      </w:pPr>
+      <w:r>
+        <w:rPr>
+          <w:rFonts w:cs="Arial"/>
+        </w:rPr>
+        <w:t xml:space="preserve">  In </w:t>
+      </w:r>
+      <w:proofErr w:type="spellStart"/>
+      <w:r>
+        <w:rPr>
+          <w:rFonts w:cs="Arial"/>
+        </w:rPr>
+        <w:t>MuseScore</w:t>
+      </w:r>
+      <w:proofErr w:type="spellEnd"/>
+      <w:r>
+        <w:rPr>
+          <w:rFonts w:cs="Arial"/>
+        </w:rPr>
+        <w:t>: Properties-Panel</w:t>
+      </w:r>
+    </w:p>
+    <w:p>
+      <w:pPr>
+        <w:pStyle w:val="Textkrper2"/>
+        <w:ind w:left="0"/>
+        <w:rPr>
+          <w:rFonts w:cs="Arial"/>
+        </w:rPr>
+      </w:pPr>
+    </w:p>
+    <w:p>
+      <w:pPr>
+        <w:pStyle w:val="Textkrper2"/>
+        <w:ind w:left="0"/>
+        <w:rPr>
+          <w:rFonts w:cs="Arial"/>
+        </w:rPr>
+      </w:pPr>
+      <w:r>
+        <w:rPr>
+          <w:rFonts w:cs="Arial"/>
+        </w:rPr>
+        <w:t xml:space="preserve">  1. Note anklicken</w:t>
+      </w:r>
+    </w:p>
+    <w:p>
+      <w:pPr>
+        <w:pStyle w:val="Textkrper2"/>
+        <w:ind w:left="0"/>
+        <w:rPr>
+          <w:rFonts w:cs="Arial"/>
+        </w:rPr>
+      </w:pPr>
+      <w:r>
+        <w:rPr>
+          <w:rFonts w:cs="Arial"/>
+        </w:rPr>
+        <w:t xml:space="preserve">  2. Properties (rechtes Panel) &gt; Tuning</w:t>
+      </w:r>
+    </w:p>
+    <w:p>
+      <w:pPr>
+        <w:pStyle w:val="Textkrper2"/>
+        <w:ind w:left="0"/>
+        <w:rPr>
+          <w:rFonts w:cs="Arial"/>
+        </w:rPr>
+      </w:pPr>
+      <w:r>
+        <w:rPr>
+          <w:rFonts w:cs="Arial"/>
+        </w:rPr>
+        <w:t xml:space="preserve">  3. Wert in Cents eingeben: +4 für 4 Cent höher</w:t>
+      </w:r>
+    </w:p>
+    <w:p>
+      <w:pPr>
+        <w:pStyle w:val="Textkrper2"/>
+        <w:ind w:left="0"/>
+        <w:rPr>
+          <w:rFonts w:cs="Arial"/>
+        </w:rPr>
+      </w:pPr>
+    </w:p>
+    <w:p>
+      <w:pPr>
+        <w:pStyle w:val="Textkrper2"/>
+        <w:ind w:left="0"/>
+        <w:rPr>
+          <w:rFonts w:cs="Arial"/>
+        </w:rPr>
+      </w:pPr>
+      <w:r>
+        <w:rPr>
+          <w:rFonts w:cs="Arial"/>
+        </w:rPr>
+        <w:t xml:space="preserve">  Das wird intern als Wiedergabe-Offset gespeichert, die Notation bleibt ein normales C.</w:t>
+      </w:r>
+    </w:p>
+    <w:p>
+      <w:pPr>
+        <w:pStyle w:val="Textkrper2"/>
+        <w:ind w:left="0"/>
+        <w:rPr>
+          <w:rFonts w:cs="Arial"/>
+        </w:rPr>
+      </w:pPr>
+    </w:p>
+    <w:p>
+      <w:pPr>
+        <w:pStyle w:val="Textkrper2"/>
+        <w:ind w:left="0"/>
+        <w:rPr>
+          <w:rFonts w:cs="Arial"/>
+        </w:rPr>
+      </w:pPr>
+      <w:r>
+        <w:rPr>
+          <w:rFonts w:cs="Arial"/>
+        </w:rPr>
+        <w:t xml:space="preserve">  ---</w:t>
+      </w:r>
+    </w:p>
+    <w:p>
+      <w:pPr>
+        <w:pStyle w:val="Textkrper2"/>
+        <w:ind w:left="0"/>
+        <w:rPr>
+          <w:rFonts w:cs="Arial"/>
+        </w:rPr>
+      </w:pPr>
+      <w:r>
+        <w:rPr>
+          <w:rFonts w:cs="Arial"/>
+        </w:rPr>
+        <w:t xml:space="preserve">  Notenlänge: "1% länger"</w:t>
+      </w:r>
+    </w:p>
+    <w:p>
+      <w:pPr>
+        <w:pStyle w:val="Textkrper2"/>
+        <w:ind w:left="0"/>
+        <w:rPr>
+          <w:rFonts w:cs="Arial"/>
+        </w:rPr>
+      </w:pPr>
+    </w:p>
+    <w:p>
+      <w:pPr>
+        <w:pStyle w:val="Textkrper2"/>
+        <w:ind w:left="0"/>
+        <w:rPr>
+          <w:rFonts w:cs="Arial"/>
+        </w:rPr>
+      </w:pPr>
+      <w:r>
+        <w:rPr>
+          <w:rFonts w:cs="Arial"/>
+        </w:rPr>
+        <w:t xml:space="preserve">  Das Problem</w:t>
+      </w:r>
+    </w:p>
+    <w:p>
+      <w:pPr>
+        <w:pStyle w:val="Textkrper2"/>
+        <w:ind w:left="0"/>
+        <w:rPr>
+          <w:rFonts w:cs="Arial"/>
+        </w:rPr>
+      </w:pPr>
+    </w:p>
+    <w:p>
+      <w:pPr>
+        <w:pStyle w:val="Textkrper2"/>
+        <w:ind w:left="0"/>
+        <w:rPr>
+          <w:rFonts w:cs="Arial"/>
+        </w:rPr>
+      </w:pPr>
+      <w:r>
+        <w:rPr>
+          <w:rFonts w:cs="Arial"/>
+        </w:rPr>
         <w:t xml:space="preserve">  </w:t>
       </w:r>
-      <w:proofErr w:type="gramStart"/>
-      <w:r>
-        <w:rPr>
-          <w:rFonts w:cs="Arial"/>
-        </w:rPr>
-        <w:t>&lt;!--</w:t>
-      </w:r>
-      <w:proofErr w:type="gramEnd"/>
-      <w:r>
-        <w:rPr>
-          <w:rFonts w:cs="Arial"/>
-        </w:rPr>
-        <w:t xml:space="preserve"> C4, 4 Cent höher (4% eines Halbtons) --&gt;</w:t>
-      </w:r>
-    </w:p>
-    <w:p>
-      <w:pPr>
-        <w:pStyle w:val="Textkrper2"/>
-        <w:ind w:left="0"/>
-        <w:rPr>
-          <w:rFonts w:cs="Arial"/>
-        </w:rPr>
-      </w:pPr>
-      <w:r>
-        <w:rPr>
-          <w:rFonts w:cs="Arial"/>
-        </w:rPr>
-        <w:t xml:space="preserve">  &lt;pitch&gt;</w:t>
-      </w:r>
-    </w:p>
-    <w:p>
-      <w:pPr>
-        <w:pStyle w:val="Textkrper2"/>
-        <w:ind w:left="0"/>
-        <w:rPr>
-          <w:rFonts w:cs="Arial"/>
-        </w:rPr>
-      </w:pPr>
-      <w:r>
-        <w:rPr>
-          <w:rFonts w:cs="Arial"/>
-        </w:rPr>
-        <w:t xml:space="preserve">    &lt;</w:t>
-      </w:r>
       <w:proofErr w:type="spellStart"/>
       <w:r>
         <w:rPr>
           <w:rFonts w:cs="Arial"/>
         </w:rPr>
-        <w:t>step</w:t>
+        <w:t>MusicXML</w:t>
       </w:r>
       <w:proofErr w:type="spellEnd"/>
       <w:r>
         <w:rPr>
           <w:rFonts w:cs="Arial"/>
         </w:rPr>
-        <w:t>&gt;C&lt;/</w:t>
+        <w:t xml:space="preserve"> kennt nur ganzzahlige Ticks für &lt;</w:t>
       </w:r>
       <w:proofErr w:type="spellStart"/>
       <w:r>
         <w:rPr>
           <w:rFonts w:cs="Arial"/>
         </w:rPr>
-        <w:t>step</w:t>
+        <w:t>duration</w:t>
       </w:r>
       <w:proofErr w:type="spellEnd"/>
       <w:r>
         <w:rPr>
           <w:rFonts w:cs="Arial"/>
         </w:rPr>
+        <w:t>&gt;:</w:t>
+      </w:r>
+    </w:p>
+    <w:p>
+      <w:pPr>
+        <w:pStyle w:val="Textkrper2"/>
+        <w:ind w:left="0"/>
+        <w:rPr>
+          <w:rFonts w:cs="Arial"/>
+        </w:rPr>
+      </w:pPr>
+      <w:r>
+        <w:rPr>
+          <w:rFonts w:cs="Arial"/>
+        </w:rPr>
+        <w:t xml:space="preserve">  &lt;</w:t>
+      </w:r>
+      <w:proofErr w:type="spellStart"/>
+      <w:r>
+        <w:rPr>
+          <w:rFonts w:cs="Arial"/>
+        </w:rPr>
+        <w:t>divisions</w:t>
+      </w:r>
+      <w:proofErr w:type="spellEnd"/>
+      <w:r>
+        <w:rPr>
+          <w:rFonts w:cs="Arial"/>
+        </w:rPr>
+        <w:t>&gt;4&lt;/</w:t>
+      </w:r>
+      <w:proofErr w:type="spellStart"/>
+      <w:r>
+        <w:rPr>
+          <w:rFonts w:cs="Arial"/>
+        </w:rPr>
+        <w:t>divisions</w:t>
+      </w:r>
+      <w:proofErr w:type="spellEnd"/>
+      <w:r>
+        <w:rPr>
+          <w:rFonts w:cs="Arial"/>
+        </w:rPr>
+        <w:t>&gt;     &lt;!-- 4 Ticks = Viertelnote --&gt;</w:t>
+      </w:r>
+    </w:p>
+    <w:p>
+      <w:pPr>
+        <w:pStyle w:val="Textkrper2"/>
+        <w:ind w:left="0"/>
+        <w:rPr>
+          <w:rFonts w:cs="Arial"/>
+        </w:rPr>
+      </w:pPr>
+      <w:r>
+        <w:rPr>
+          <w:rFonts w:cs="Arial"/>
+        </w:rPr>
+        <w:t xml:space="preserve">  &lt;</w:t>
+      </w:r>
+      <w:proofErr w:type="spellStart"/>
+      <w:r>
+        <w:rPr>
+          <w:rFonts w:cs="Arial"/>
+        </w:rPr>
+        <w:t>duration</w:t>
+      </w:r>
+      <w:proofErr w:type="spellEnd"/>
+      <w:r>
+        <w:rPr>
+          <w:rFonts w:cs="Arial"/>
+        </w:rPr>
+        <w:t>&gt;4&lt;/</w:t>
+      </w:r>
+      <w:proofErr w:type="spellStart"/>
+      <w:r>
+        <w:rPr>
+          <w:rFonts w:cs="Arial"/>
+        </w:rPr>
+        <w:t>duration</w:t>
+      </w:r>
+      <w:proofErr w:type="spellEnd"/>
+      <w:r>
+        <w:rPr>
+          <w:rFonts w:cs="Arial"/>
+        </w:rPr>
+        <w:t>&gt;       &lt;!-- genau eine Viertelnote --&gt;</w:t>
+      </w:r>
+    </w:p>
+    <w:p>
+      <w:pPr>
+        <w:pStyle w:val="Textkrper2"/>
+        <w:ind w:left="0"/>
+        <w:rPr>
+          <w:rFonts w:cs="Arial"/>
+        </w:rPr>
+      </w:pPr>
+      <w:r>
+        <w:rPr>
+          <w:rFonts w:cs="Arial"/>
+        </w:rPr>
+        <w:t xml:space="preserve">  &lt;</w:t>
+      </w:r>
+      <w:proofErr w:type="spellStart"/>
+      <w:r>
+        <w:rPr>
+          <w:rFonts w:cs="Arial"/>
+        </w:rPr>
+        <w:t>duration</w:t>
+      </w:r>
+      <w:proofErr w:type="spellEnd"/>
+      <w:r>
+        <w:rPr>
+          <w:rFonts w:cs="Arial"/>
+        </w:rPr>
+        <w:t>&gt;5&lt;/</w:t>
+      </w:r>
+      <w:proofErr w:type="spellStart"/>
+      <w:r>
+        <w:rPr>
+          <w:rFonts w:cs="Arial"/>
+        </w:rPr>
+        <w:t>duration</w:t>
+      </w:r>
+      <w:proofErr w:type="spellEnd"/>
+      <w:r>
+        <w:rPr>
+          <w:rFonts w:cs="Arial"/>
+        </w:rPr>
+        <w:t>&gt;       &lt;!-- 25% länger - viel zu viel! --&gt;</w:t>
+      </w:r>
+    </w:p>
+    <w:p>
+      <w:pPr>
+        <w:pStyle w:val="Textkrper2"/>
+        <w:ind w:left="0"/>
+        <w:rPr>
+          <w:rFonts w:cs="Arial"/>
+        </w:rPr>
+      </w:pPr>
+    </w:p>
+    <w:p>
+      <w:pPr>
+        <w:pStyle w:val="Textkrper2"/>
+        <w:ind w:left="0"/>
+        <w:rPr>
+          <w:rFonts w:cs="Arial"/>
+        </w:rPr>
+      </w:pPr>
+      <w:r>
+        <w:rPr>
+          <w:rFonts w:cs="Arial"/>
+        </w:rPr>
+        <w:t xml:space="preserve">  1% von 4 Ticks = 0,04 Ticks → geht nicht mit </w:t>
+      </w:r>
+      <w:proofErr w:type="spellStart"/>
+      <w:r>
+        <w:rPr>
+          <w:rFonts w:cs="Arial"/>
+        </w:rPr>
+        <w:t>divisions</w:t>
+      </w:r>
+      <w:proofErr w:type="spellEnd"/>
+      <w:r>
+        <w:rPr>
+          <w:rFonts w:cs="Arial"/>
+        </w:rPr>
+        <w:t>=4.</w:t>
+      </w:r>
+    </w:p>
+    <w:p>
+      <w:pPr>
+        <w:pStyle w:val="Textkrper2"/>
+        <w:ind w:left="0"/>
+        <w:rPr>
+          <w:rFonts w:cs="Arial"/>
+        </w:rPr>
+      </w:pPr>
+    </w:p>
+    <w:p>
+      <w:pPr>
+        <w:pStyle w:val="Textkrper2"/>
+        <w:ind w:left="0"/>
+        <w:rPr>
+          <w:rFonts w:cs="Arial"/>
+        </w:rPr>
+      </w:pPr>
+      <w:r>
+        <w:rPr>
+          <w:rFonts w:cs="Arial"/>
+        </w:rPr>
+        <w:t xml:space="preserve">  Lösung: </w:t>
+      </w:r>
+      <w:proofErr w:type="spellStart"/>
+      <w:r>
+        <w:rPr>
+          <w:rFonts w:cs="Arial"/>
+        </w:rPr>
+        <w:t>Divisions</w:t>
+      </w:r>
+      <w:proofErr w:type="spellEnd"/>
+      <w:r>
+        <w:rPr>
+          <w:rFonts w:cs="Arial"/>
+        </w:rPr>
+        <w:t xml:space="preserve"> hochsetzen</w:t>
+      </w:r>
+    </w:p>
+    <w:p>
+      <w:pPr>
+        <w:pStyle w:val="Textkrper2"/>
+        <w:ind w:left="0"/>
+        <w:rPr>
+          <w:rFonts w:cs="Arial"/>
+        </w:rPr>
+      </w:pPr>
+    </w:p>
+    <w:p>
+      <w:pPr>
+        <w:pStyle w:val="Textkrper2"/>
+        <w:ind w:left="0"/>
+        <w:rPr>
+          <w:rFonts w:cs="Arial"/>
+        </w:rPr>
+      </w:pPr>
+      <w:r>
+        <w:rPr>
+          <w:rFonts w:cs="Arial"/>
+        </w:rPr>
+        <w:t xml:space="preserve">  &lt;</w:t>
+      </w:r>
+      <w:proofErr w:type="spellStart"/>
+      <w:r>
+        <w:rPr>
+          <w:rFonts w:cs="Arial"/>
+        </w:rPr>
+        <w:t>divisions</w:t>
+      </w:r>
+      <w:proofErr w:type="spellEnd"/>
+      <w:r>
+        <w:rPr>
+          <w:rFonts w:cs="Arial"/>
+        </w:rPr>
+        <w:t>&gt;480&lt;/</w:t>
+      </w:r>
+      <w:proofErr w:type="spellStart"/>
+      <w:r>
+        <w:rPr>
+          <w:rFonts w:cs="Arial"/>
+        </w:rPr>
+        <w:t>divisions</w:t>
+      </w:r>
+      <w:proofErr w:type="spellEnd"/>
+      <w:r>
+        <w:rPr>
+          <w:rFonts w:cs="Arial"/>
+        </w:rPr>
+        <w:t>&gt;   &lt;!-- 480 Ticks = eine Viertelnote (DAW-üblich!) --&gt;</w:t>
+      </w:r>
+    </w:p>
+    <w:p>
+      <w:pPr>
+        <w:pStyle w:val="Textkrper2"/>
+        <w:ind w:left="0"/>
+        <w:rPr>
+          <w:rFonts w:cs="Arial"/>
+        </w:rPr>
+      </w:pPr>
+    </w:p>
+    <w:p>
+      <w:pPr>
+        <w:pStyle w:val="Textkrper2"/>
+        <w:ind w:left="0"/>
+        <w:rPr>
+          <w:rFonts w:cs="Arial"/>
+        </w:rPr>
+      </w:pPr>
+      <w:r>
+        <w:rPr>
+          <w:rFonts w:cs="Arial"/>
+        </w:rPr>
+        <w:t xml:space="preserve">  &lt;!-- Exakte Viertelnote --&gt;</w:t>
+      </w:r>
+    </w:p>
+    <w:p>
+      <w:pPr>
+        <w:pStyle w:val="Textkrper2"/>
+        <w:ind w:left="0"/>
+        <w:rPr>
+          <w:rFonts w:cs="Arial"/>
+        </w:rPr>
+      </w:pPr>
+      <w:r>
+        <w:rPr>
+          <w:rFonts w:cs="Arial"/>
+        </w:rPr>
+        <w:t xml:space="preserve">  &lt;</w:t>
+      </w:r>
+      <w:proofErr w:type="spellStart"/>
+      <w:r>
+        <w:rPr>
+          <w:rFonts w:cs="Arial"/>
+        </w:rPr>
+        <w:t>duration</w:t>
+      </w:r>
+      <w:proofErr w:type="spellEnd"/>
+      <w:r>
+        <w:rPr>
+          <w:rFonts w:cs="Arial"/>
+        </w:rPr>
+        <w:t>&gt;480&lt;/</w:t>
+      </w:r>
+      <w:proofErr w:type="spellStart"/>
+      <w:r>
+        <w:rPr>
+          <w:rFonts w:cs="Arial"/>
+        </w:rPr>
+        <w:t>duration</w:t>
+      </w:r>
+      <w:proofErr w:type="spellEnd"/>
+      <w:r>
+        <w:rPr>
+          <w:rFonts w:cs="Arial"/>
+        </w:rPr>
         <w:t>&gt;</w:t>
       </w:r>
     </w:p>
@@ -1816,93 +2944,429 @@
           <w:rFonts w:cs="Arial"/>
         </w:rPr>
       </w:pPr>
-      <w:r>
-        <w:rPr>
-          <w:rFonts w:cs="Arial"/>
-        </w:rPr>
-        <w:t xml:space="preserve">    &lt;alter&gt;0.04&lt;/alter&gt;       </w:t>
-      </w:r>
-      <w:proofErr w:type="gramStart"/>
-      <w:r>
-        <w:rPr>
-          <w:rFonts w:cs="Arial"/>
-        </w:rPr>
-        <w:t>&lt;!--</w:t>
-      </w:r>
-      <w:proofErr w:type="gramEnd"/>
-      <w:r>
-        <w:rPr>
-          <w:rFonts w:cs="Arial"/>
-        </w:rPr>
-        <w:t xml:space="preserve"> 0.04 Halbtöne = 4 Cent --&gt;</w:t>
-      </w:r>
-    </w:p>
-    <w:p>
-      <w:pPr>
-        <w:pStyle w:val="Textkrper2"/>
-        <w:ind w:left="0"/>
-        <w:rPr>
-          <w:rFonts w:cs="Arial"/>
-        </w:rPr>
-      </w:pPr>
-      <w:r>
-        <w:rPr>
-          <w:rFonts w:cs="Arial"/>
-        </w:rPr>
-        <w:t xml:space="preserve">    &lt;</w:t>
+    </w:p>
+    <w:p>
+      <w:pPr>
+        <w:pStyle w:val="Textkrper2"/>
+        <w:ind w:left="0"/>
+        <w:rPr>
+          <w:rFonts w:cs="Arial"/>
+        </w:rPr>
+      </w:pPr>
+      <w:r>
+        <w:rPr>
+          <w:rFonts w:cs="Arial"/>
+        </w:rPr>
+        <w:t xml:space="preserve">  &lt;!-- 1% länger --&gt;</w:t>
+      </w:r>
+    </w:p>
+    <w:p>
+      <w:pPr>
+        <w:pStyle w:val="Textkrper2"/>
+        <w:ind w:left="0"/>
+        <w:rPr>
+          <w:rFonts w:cs="Arial"/>
+        </w:rPr>
+      </w:pPr>
+      <w:r>
+        <w:rPr>
+          <w:rFonts w:cs="Arial"/>
+        </w:rPr>
+        <w:t xml:space="preserve">  &lt;</w:t>
       </w:r>
       <w:proofErr w:type="spellStart"/>
       <w:r>
         <w:rPr>
           <w:rFonts w:cs="Arial"/>
         </w:rPr>
-        <w:t>octave</w:t>
+        <w:t>duration</w:t>
       </w:r>
       <w:proofErr w:type="spellEnd"/>
       <w:r>
         <w:rPr>
           <w:rFonts w:cs="Arial"/>
         </w:rPr>
-        <w:t>&gt;4&lt;/</w:t>
+        <w:t>&gt;485&lt;/</w:t>
       </w:r>
       <w:proofErr w:type="spellStart"/>
       <w:r>
         <w:rPr>
           <w:rFonts w:cs="Arial"/>
         </w:rPr>
-        <w:t>octave</w:t>
+        <w:t>duration</w:t>
       </w:r>
       <w:proofErr w:type="spellEnd"/>
       <w:r>
         <w:rPr>
           <w:rFonts w:cs="Arial"/>
         </w:rPr>
-        <w:t>&gt;</w:t>
-      </w:r>
-    </w:p>
-    <w:p>
-      <w:pPr>
-        <w:pStyle w:val="Textkrper2"/>
-        <w:ind w:left="0"/>
-        <w:rPr>
-          <w:rFonts w:cs="Arial"/>
-        </w:rPr>
-      </w:pPr>
-      <w:r>
-        <w:rPr>
-          <w:rFonts w:cs="Arial"/>
-        </w:rPr>
-        <w:t xml:space="preserve">  &lt;/pitch&gt;</w:t>
-      </w:r>
-    </w:p>
-    <w:p>
-      <w:pPr>
-        <w:pStyle w:val="Textkrper2"/>
-        <w:ind w:left="0"/>
-        <w:rPr>
-          <w:rFonts w:cs="Arial"/>
-        </w:rPr>
-      </w:pPr>
+        <w:t>&gt;     &lt;!-- 480 × 1.01 = 484.8 ≈ 485 --&gt;</w:t>
+      </w:r>
+    </w:p>
+    <w:p>
+      <w:pPr>
+        <w:pStyle w:val="Textkrper2"/>
+        <w:ind w:left="0"/>
+        <w:rPr>
+          <w:rFonts w:cs="Arial"/>
+        </w:rPr>
+      </w:pPr>
+    </w:p>
+    <w:p>
+      <w:pPr>
+        <w:pStyle w:val="Textkrper2"/>
+        <w:ind w:left="0"/>
+        <w:rPr>
+          <w:rFonts w:cs="Arial"/>
+        </w:rPr>
+      </w:pPr>
+      <w:r>
+        <w:rPr>
+          <w:rFonts w:cs="Arial"/>
+        </w:rPr>
+        <w:t xml:space="preserve">  &lt;!-- 5% länger --&gt;</w:t>
+      </w:r>
+    </w:p>
+    <w:p>
+      <w:pPr>
+        <w:pStyle w:val="Textkrper2"/>
+        <w:ind w:left="0"/>
+        <w:rPr>
+          <w:rFonts w:cs="Arial"/>
+        </w:rPr>
+      </w:pPr>
+      <w:r>
+        <w:rPr>
+          <w:rFonts w:cs="Arial"/>
+        </w:rPr>
+        <w:t xml:space="preserve">  &lt;</w:t>
+      </w:r>
+      <w:proofErr w:type="spellStart"/>
+      <w:r>
+        <w:rPr>
+          <w:rFonts w:cs="Arial"/>
+        </w:rPr>
+        <w:t>duration</w:t>
+      </w:r>
+      <w:proofErr w:type="spellEnd"/>
+      <w:r>
+        <w:rPr>
+          <w:rFonts w:cs="Arial"/>
+        </w:rPr>
+        <w:t>&gt;504&lt;/</w:t>
+      </w:r>
+      <w:proofErr w:type="spellStart"/>
+      <w:r>
+        <w:rPr>
+          <w:rFonts w:cs="Arial"/>
+        </w:rPr>
+        <w:t>duration</w:t>
+      </w:r>
+      <w:proofErr w:type="spellEnd"/>
+      <w:r>
+        <w:rPr>
+          <w:rFonts w:cs="Arial"/>
+        </w:rPr>
+        <w:t>&gt;     &lt;!-- 480 × 1.05 = 504 --&gt;</w:t>
+      </w:r>
+    </w:p>
+    <w:p>
+      <w:pPr>
+        <w:pStyle w:val="Textkrper2"/>
+        <w:ind w:left="0"/>
+        <w:rPr>
+          <w:rFonts w:cs="Arial"/>
+        </w:rPr>
+      </w:pPr>
+    </w:p>
+    <w:p>
+      <w:pPr>
+        <w:pStyle w:val="Textkrper2"/>
+        <w:ind w:left="0"/>
+        <w:rPr>
+          <w:rFonts w:cs="Arial"/>
+        </w:rPr>
+      </w:pPr>
+      <w:r>
+        <w:rPr>
+          <w:rFonts w:cs="Arial"/>
+        </w:rPr>
+        <w:t xml:space="preserve">  &lt;!-- 0.5% länger --&gt;</w:t>
+      </w:r>
+    </w:p>
+    <w:p>
+      <w:pPr>
+        <w:pStyle w:val="Textkrper2"/>
+        <w:ind w:left="0"/>
+        <w:rPr>
+          <w:rFonts w:cs="Arial"/>
+        </w:rPr>
+      </w:pPr>
+      <w:r>
+        <w:rPr>
+          <w:rFonts w:cs="Arial"/>
+        </w:rPr>
+        <w:t xml:space="preserve">  &lt;</w:t>
+      </w:r>
+      <w:proofErr w:type="spellStart"/>
+      <w:r>
+        <w:rPr>
+          <w:rFonts w:cs="Arial"/>
+        </w:rPr>
+        <w:t>duration</w:t>
+      </w:r>
+      <w:proofErr w:type="spellEnd"/>
+      <w:r>
+        <w:rPr>
+          <w:rFonts w:cs="Arial"/>
+        </w:rPr>
+        <w:t>&gt;482&lt;/</w:t>
+      </w:r>
+      <w:proofErr w:type="spellStart"/>
+      <w:r>
+        <w:rPr>
+          <w:rFonts w:cs="Arial"/>
+        </w:rPr>
+        <w:t>duration</w:t>
+      </w:r>
+      <w:proofErr w:type="spellEnd"/>
+      <w:r>
+        <w:rPr>
+          <w:rFonts w:cs="Arial"/>
+        </w:rPr>
+        <w:t>&gt;     &lt;!-- 480 × 1.005 = 482.4 ≈ 482 --&gt;</w:t>
+      </w:r>
+    </w:p>
+    <w:p>
+      <w:pPr>
+        <w:pStyle w:val="Textkrper2"/>
+        <w:ind w:left="0"/>
+        <w:rPr>
+          <w:rFonts w:cs="Arial"/>
+        </w:rPr>
+      </w:pPr>
+    </w:p>
+    <w:p>
+      <w:pPr>
+        <w:pStyle w:val="Textkrper2"/>
+        <w:ind w:left="0"/>
+        <w:rPr>
+          <w:rFonts w:cs="Arial"/>
+        </w:rPr>
+      </w:pPr>
+      <w:r>
+        <w:rPr>
+          <w:rFonts w:cs="Arial"/>
+        </w:rPr>
+        <w:t xml:space="preserve">  Mit </w:t>
+      </w:r>
+      <w:proofErr w:type="spellStart"/>
+      <w:r>
+        <w:rPr>
+          <w:rFonts w:cs="Arial"/>
+        </w:rPr>
+        <w:t>divisions</w:t>
+      </w:r>
+      <w:proofErr w:type="spellEnd"/>
+      <w:r>
+        <w:rPr>
+          <w:rFonts w:cs="Arial"/>
+        </w:rPr>
+        <w:t>=480 ist die kleinste Einheit ~0,2% einer Viertelnote - genau genug.</w:t>
+      </w:r>
+    </w:p>
+    <w:p>
+      <w:pPr>
+        <w:pStyle w:val="Textkrper2"/>
+        <w:ind w:left="0"/>
+        <w:rPr>
+          <w:rFonts w:cs="Arial"/>
+        </w:rPr>
+      </w:pPr>
+    </w:p>
+    <w:p>
+      <w:pPr>
+        <w:pStyle w:val="Textkrper2"/>
+        <w:ind w:left="0"/>
+        <w:rPr>
+          <w:rFonts w:cs="Arial"/>
+        </w:rPr>
+      </w:pPr>
+      <w:r>
+        <w:rPr>
+          <w:rFonts w:cs="Arial"/>
+        </w:rPr>
+        <w:t xml:space="preserve">  In </w:t>
+      </w:r>
+      <w:proofErr w:type="spellStart"/>
+      <w:r>
+        <w:rPr>
+          <w:rFonts w:cs="Arial"/>
+        </w:rPr>
+        <w:t>MuseScore</w:t>
+      </w:r>
+      <w:proofErr w:type="spellEnd"/>
+      <w:r>
+        <w:rPr>
+          <w:rFonts w:cs="Arial"/>
+        </w:rPr>
+        <w:t>: Piano Roll Editor</w:t>
+      </w:r>
+    </w:p>
+    <w:p>
+      <w:pPr>
+        <w:pStyle w:val="Textkrper2"/>
+        <w:ind w:left="0"/>
+        <w:rPr>
+          <w:rFonts w:cs="Arial"/>
+        </w:rPr>
+      </w:pPr>
+    </w:p>
+    <w:p>
+      <w:pPr>
+        <w:pStyle w:val="Textkrper2"/>
+        <w:ind w:left="0"/>
+        <w:rPr>
+          <w:rFonts w:cs="Arial"/>
+        </w:rPr>
+      </w:pPr>
+      <w:r>
+        <w:rPr>
+          <w:rFonts w:cs="Arial"/>
+        </w:rPr>
+        <w:t xml:space="preserve">  1. Ansicht &gt; Piano Roll Editor</w:t>
+      </w:r>
+    </w:p>
+    <w:p>
+      <w:pPr>
+        <w:pStyle w:val="Textkrper2"/>
+        <w:ind w:left="0"/>
+        <w:rPr>
+          <w:rFonts w:cs="Arial"/>
+        </w:rPr>
+      </w:pPr>
+      <w:r>
+        <w:rPr>
+          <w:rFonts w:cs="Arial"/>
+        </w:rPr>
+        <w:t xml:space="preserve">  2. Note anklicken und am rechten Rand ziehen → Länge stufenlos ändern</w:t>
+      </w:r>
+    </w:p>
+    <w:p>
+      <w:pPr>
+        <w:pStyle w:val="Textkrper2"/>
+        <w:ind w:left="0"/>
+        <w:rPr>
+          <w:rFonts w:cs="Arial"/>
+        </w:rPr>
+      </w:pPr>
+      <w:r>
+        <w:rPr>
+          <w:rFonts w:cs="Arial"/>
+        </w:rPr>
+        <w:t xml:space="preserve">  3. Note nach links/rechts verschieben → Timing-Offset (Note kommt etwas früher/später)</w:t>
+      </w:r>
+    </w:p>
+    <w:p>
+      <w:pPr>
+        <w:pStyle w:val="Textkrper2"/>
+        <w:ind w:left="0"/>
+        <w:rPr>
+          <w:rFonts w:cs="Arial"/>
+        </w:rPr>
+      </w:pPr>
+    </w:p>
+    <w:p>
+      <w:pPr>
+        <w:pStyle w:val="Textkrper2"/>
+        <w:ind w:left="0"/>
+        <w:rPr>
+          <w:rFonts w:cs="Arial"/>
+        </w:rPr>
+      </w:pPr>
+      <w:r>
+        <w:rPr>
+          <w:rFonts w:cs="Arial"/>
+        </w:rPr>
+        <w:t xml:space="preserve">  ---</w:t>
+      </w:r>
+    </w:p>
+    <w:p>
+      <w:pPr>
+        <w:pStyle w:val="Textkrper2"/>
+        <w:ind w:left="0"/>
+        <w:rPr>
+          <w:rFonts w:cs="Arial"/>
+        </w:rPr>
+      </w:pPr>
+      <w:r>
+        <w:rPr>
+          <w:rFonts w:cs="Arial"/>
+        </w:rPr>
+        <w:t xml:space="preserve">  Vollständiges Beispiel: Expressives C4</w:t>
+      </w:r>
+    </w:p>
+    <w:p>
+      <w:pPr>
+        <w:pStyle w:val="Textkrper2"/>
+        <w:ind w:left="0"/>
+        <w:rPr>
+          <w:rFonts w:cs="Arial"/>
+        </w:rPr>
+      </w:pPr>
+    </w:p>
+    <w:p>
+      <w:pPr>
+        <w:pStyle w:val="Textkrper2"/>
+        <w:ind w:left="0"/>
+        <w:rPr>
+          <w:rFonts w:cs="Arial"/>
+        </w:rPr>
+      </w:pPr>
+      <w:r>
+        <w:rPr>
+          <w:rFonts w:cs="Arial"/>
+        </w:rPr>
+        <w:t xml:space="preserve">  Ich aktualisiere die Beispieldatei:</w:t>
+      </w:r>
+    </w:p>
+    <w:p>
+      <w:pPr>
+        <w:pStyle w:val="Textkrper2"/>
+        <w:ind w:left="0"/>
+        <w:rPr>
+          <w:rFonts w:cs="Arial"/>
+        </w:rPr>
+      </w:pPr>
+    </w:p>
+    <w:p>
+      <w:pPr>
+        <w:pStyle w:val="Textkrper2"/>
+        <w:ind w:left="0"/>
+        <w:rPr>
+          <w:rFonts w:cs="Arial"/>
+        </w:rPr>
+      </w:pPr>
+      <w:r>
+        <w:rPr>
+          <w:rFonts w:cs="Arial"/>
+        </w:rPr>
+        <w:t>● Write(Recherche\</w:t>
+      </w:r>
+      <w:proofErr w:type="spellStart"/>
+      <w:r>
+        <w:rPr>
+          <w:rFonts w:cs="Arial"/>
+        </w:rPr>
+        <w:t>beispiel_micro_expression.musicxml</w:t>
+      </w:r>
+      <w:proofErr w:type="spellEnd"/>
+      <w:r>
+        <w:rPr>
+          <w:rFonts w:cs="Arial"/>
+        </w:rPr>
+        <w:t>)</w:t>
+      </w:r>
     </w:p>
     <w:p>
       <w:pPr>
@@ -1918,359 +3382,173 @@
         </w:rPr>
         <w:t xml:space="preserve">  </w:t>
       </w:r>
-      <w:proofErr w:type="gramStart"/>
-      <w:r>
-        <w:rPr>
-          <w:rFonts w:cs="Arial"/>
-        </w:rPr>
-        <w:t>&lt;!--</w:t>
-      </w:r>
-      <w:proofErr w:type="gramEnd"/>
-      <w:r>
-        <w:rPr>
-          <w:rFonts w:cs="Arial"/>
-        </w:rPr>
-        <w:t xml:space="preserve"> C4, 40 Cent höher (fast ein Viertelton) --&gt;</w:t>
-      </w:r>
-    </w:p>
-    <w:p>
-      <w:pPr>
-        <w:pStyle w:val="Textkrper2"/>
-        <w:ind w:left="0"/>
-        <w:rPr>
-          <w:rFonts w:cs="Arial"/>
-        </w:rPr>
-      </w:pPr>
-      <w:r>
-        <w:rPr>
-          <w:rFonts w:cs="Arial"/>
-        </w:rPr>
-        <w:t xml:space="preserve">  &lt;pitch&gt;</w:t>
-      </w:r>
-    </w:p>
-    <w:p>
-      <w:pPr>
-        <w:pStyle w:val="Textkrper2"/>
-        <w:ind w:left="0"/>
-        <w:rPr>
-          <w:rFonts w:cs="Arial"/>
-        </w:rPr>
-      </w:pPr>
-      <w:r>
-        <w:rPr>
-          <w:rFonts w:cs="Arial"/>
-        </w:rPr>
-        <w:t xml:space="preserve">    &lt;</w:t>
+      <w:r>
+        <w:rPr>
+          <w:rFonts w:ascii="Cambria Math" w:hAnsi="Cambria Math" w:cs="Cambria Math"/>
+        </w:rPr>
+        <w:t>⎿</w:t>
+      </w:r>
+      <w:r>
+        <w:rPr>
+          <w:rFonts w:cs="Arial"/>
+        </w:rPr>
+        <w:t xml:space="preserve">  </w:t>
       </w:r>
       <w:proofErr w:type="spellStart"/>
       <w:r>
         <w:rPr>
           <w:rFonts w:cs="Arial"/>
         </w:rPr>
-        <w:t>step</w:t>
+        <w:t>Wrote</w:t>
       </w:r>
       <w:proofErr w:type="spellEnd"/>
       <w:r>
         <w:rPr>
           <w:rFonts w:cs="Arial"/>
         </w:rPr>
-        <w:t>&gt;C&lt;/</w:t>
+        <w:t xml:space="preserve"> 181 </w:t>
       </w:r>
       <w:proofErr w:type="spellStart"/>
       <w:r>
         <w:rPr>
           <w:rFonts w:cs="Arial"/>
         </w:rPr>
-        <w:t>step</w:t>
+        <w:t>lines</w:t>
       </w:r>
       <w:proofErr w:type="spellEnd"/>
       <w:r>
         <w:rPr>
           <w:rFonts w:cs="Arial"/>
         </w:rPr>
-        <w:t>&gt;</w:t>
-      </w:r>
-    </w:p>
-    <w:p>
-      <w:pPr>
-        <w:pStyle w:val="Textkrper2"/>
-        <w:ind w:left="0"/>
-        <w:rPr>
-          <w:rFonts w:cs="Arial"/>
-        </w:rPr>
-      </w:pPr>
-      <w:r>
-        <w:rPr>
-          <w:rFonts w:cs="Arial"/>
-        </w:rPr>
-        <w:t xml:space="preserve">    &lt;alter&gt;0.40&lt;/alter&gt;</w:t>
-      </w:r>
-    </w:p>
-    <w:p>
-      <w:pPr>
-        <w:pStyle w:val="Textkrper2"/>
-        <w:ind w:left="0"/>
-        <w:rPr>
-          <w:rFonts w:cs="Arial"/>
-        </w:rPr>
-      </w:pPr>
-      <w:r>
-        <w:rPr>
-          <w:rFonts w:cs="Arial"/>
-        </w:rPr>
-        <w:t xml:space="preserve">    &lt;</w:t>
+        <w:t xml:space="preserve"> </w:t>
       </w:r>
       <w:proofErr w:type="spellStart"/>
       <w:r>
         <w:rPr>
           <w:rFonts w:cs="Arial"/>
         </w:rPr>
-        <w:t>octave</w:t>
+        <w:t>to</w:t>
       </w:r>
       <w:proofErr w:type="spellEnd"/>
       <w:r>
         <w:rPr>
           <w:rFonts w:cs="Arial"/>
         </w:rPr>
-        <w:t>&gt;4&lt;/</w:t>
+        <w:t xml:space="preserve"> Recherche\</w:t>
       </w:r>
       <w:proofErr w:type="spellStart"/>
       <w:r>
         <w:rPr>
           <w:rFonts w:cs="Arial"/>
         </w:rPr>
-        <w:t>octave</w:t>
+        <w:t>beispiel_micro_expression.musicxml</w:t>
       </w:r>
       <w:proofErr w:type="spellEnd"/>
-      <w:r>
-        <w:rPr>
-          <w:rFonts w:cs="Arial"/>
-        </w:rPr>
-        <w:t>&gt;</w:t>
-      </w:r>
-    </w:p>
-    <w:p>
-      <w:pPr>
-        <w:pStyle w:val="Textkrper2"/>
-        <w:ind w:left="0"/>
-        <w:rPr>
-          <w:rFonts w:cs="Arial"/>
-        </w:rPr>
-      </w:pPr>
-      <w:r>
-        <w:rPr>
-          <w:rFonts w:cs="Arial"/>
-        </w:rPr>
-        <w:t xml:space="preserve">  &lt;/pitch&gt;</w:t>
-      </w:r>
-    </w:p>
-    <w:p>
-      <w:pPr>
-        <w:pStyle w:val="Textkrper2"/>
-        <w:ind w:left="0"/>
-        <w:rPr>
-          <w:rFonts w:cs="Arial"/>
-        </w:rPr>
-      </w:pPr>
-    </w:p>
-    <w:p>
-      <w:pPr>
-        <w:pStyle w:val="Textkrper2"/>
-        <w:ind w:left="0"/>
-        <w:rPr>
-          <w:rFonts w:cs="Arial"/>
-        </w:rPr>
-      </w:pPr>
-      <w:r>
-        <w:rPr>
-          <w:rFonts w:cs="Arial"/>
-        </w:rPr>
-        <w:t xml:space="preserve">  In </w:t>
+    </w:p>
+    <w:p>
+      <w:pPr>
+        <w:pStyle w:val="Textkrper2"/>
+        <w:ind w:left="0"/>
+        <w:rPr>
+          <w:rFonts w:cs="Arial"/>
+        </w:rPr>
+      </w:pPr>
+      <w:r>
+        <w:rPr>
+          <w:rFonts w:cs="Arial"/>
+        </w:rPr>
+        <w:t xml:space="preserve">       1 &lt;?</w:t>
       </w:r>
       <w:proofErr w:type="spellStart"/>
       <w:r>
         <w:rPr>
           <w:rFonts w:cs="Arial"/>
         </w:rPr>
-        <w:t>MuseScore</w:t>
+        <w:t>xml</w:t>
       </w:r>
       <w:proofErr w:type="spellEnd"/>
       <w:r>
         <w:rPr>
           <w:rFonts w:cs="Arial"/>
         </w:rPr>
-        <w:t>: Properties-Panel</w:t>
-      </w:r>
-    </w:p>
-    <w:p>
-      <w:pPr>
-        <w:pStyle w:val="Textkrper2"/>
-        <w:ind w:left="0"/>
-        <w:rPr>
-          <w:rFonts w:cs="Arial"/>
-        </w:rPr>
-      </w:pPr>
-    </w:p>
-    <w:p>
-      <w:pPr>
-        <w:pStyle w:val="Textkrper2"/>
-        <w:ind w:left="0"/>
-        <w:rPr>
-          <w:rFonts w:cs="Arial"/>
-        </w:rPr>
-      </w:pPr>
-      <w:r>
-        <w:rPr>
-          <w:rFonts w:cs="Arial"/>
-        </w:rPr>
-        <w:t xml:space="preserve">  1. Note anklicken</w:t>
-      </w:r>
-    </w:p>
-    <w:p>
-      <w:pPr>
-        <w:pStyle w:val="Textkrper2"/>
-        <w:ind w:left="0"/>
-        <w:rPr>
-          <w:rFonts w:cs="Arial"/>
-        </w:rPr>
-      </w:pPr>
-      <w:r>
-        <w:rPr>
-          <w:rFonts w:cs="Arial"/>
-        </w:rPr>
-        <w:t xml:space="preserve">  2. Properties (rechtes Panel) &gt; Tuning</w:t>
-      </w:r>
-    </w:p>
-    <w:p>
-      <w:pPr>
-        <w:pStyle w:val="Textkrper2"/>
-        <w:ind w:left="0"/>
-        <w:rPr>
-          <w:rFonts w:cs="Arial"/>
-        </w:rPr>
-      </w:pPr>
-      <w:r>
-        <w:rPr>
-          <w:rFonts w:cs="Arial"/>
-        </w:rPr>
-        <w:t xml:space="preserve">  3. Wert in Cents eingeben: +4 für 4 Cent höher</w:t>
-      </w:r>
-    </w:p>
-    <w:p>
-      <w:pPr>
-        <w:pStyle w:val="Textkrper2"/>
-        <w:ind w:left="0"/>
-        <w:rPr>
-          <w:rFonts w:cs="Arial"/>
-        </w:rPr>
-      </w:pPr>
-    </w:p>
-    <w:p>
-      <w:pPr>
-        <w:pStyle w:val="Textkrper2"/>
-        <w:ind w:left="0"/>
-        <w:rPr>
-          <w:rFonts w:cs="Arial"/>
-        </w:rPr>
-      </w:pPr>
-      <w:r>
-        <w:rPr>
-          <w:rFonts w:cs="Arial"/>
-        </w:rPr>
-        <w:t xml:space="preserve">  Das wird intern als Wiedergabe-Offset gespeichert, die Notation bleibt ein normales C.</w:t>
-      </w:r>
-    </w:p>
-    <w:p>
-      <w:pPr>
-        <w:pStyle w:val="Textkrper2"/>
-        <w:ind w:left="0"/>
-        <w:rPr>
-          <w:rFonts w:cs="Arial"/>
-        </w:rPr>
-      </w:pPr>
-    </w:p>
-    <w:p>
-      <w:pPr>
-        <w:pStyle w:val="Textkrper2"/>
-        <w:ind w:left="0"/>
-        <w:rPr>
-          <w:rFonts w:cs="Arial"/>
-        </w:rPr>
-      </w:pPr>
-      <w:r>
-        <w:rPr>
-          <w:rFonts w:cs="Arial"/>
-        </w:rPr>
-        <w:t xml:space="preserve">  ---</w:t>
-      </w:r>
-    </w:p>
-    <w:p>
-      <w:pPr>
-        <w:pStyle w:val="Textkrper2"/>
-        <w:ind w:left="0"/>
-        <w:rPr>
-          <w:rFonts w:cs="Arial"/>
-        </w:rPr>
-      </w:pPr>
-      <w:r>
-        <w:rPr>
-          <w:rFonts w:cs="Arial"/>
-        </w:rPr>
-        <w:t xml:space="preserve">  Notenlänge: "1% länger"</w:t>
-      </w:r>
-    </w:p>
-    <w:p>
-      <w:pPr>
-        <w:pStyle w:val="Textkrper2"/>
-        <w:ind w:left="0"/>
-        <w:rPr>
-          <w:rFonts w:cs="Arial"/>
-        </w:rPr>
-      </w:pPr>
-    </w:p>
-    <w:p>
-      <w:pPr>
-        <w:pStyle w:val="Textkrper2"/>
-        <w:ind w:left="0"/>
-        <w:rPr>
-          <w:rFonts w:cs="Arial"/>
-        </w:rPr>
-      </w:pPr>
-      <w:r>
-        <w:rPr>
-          <w:rFonts w:cs="Arial"/>
-        </w:rPr>
-        <w:t xml:space="preserve">  Das Problem</w:t>
-      </w:r>
-    </w:p>
-    <w:p>
-      <w:pPr>
-        <w:pStyle w:val="Textkrper2"/>
-        <w:ind w:left="0"/>
-        <w:rPr>
-          <w:rFonts w:cs="Arial"/>
-        </w:rPr>
-      </w:pPr>
-    </w:p>
-    <w:p>
-      <w:pPr>
-        <w:pStyle w:val="Textkrper2"/>
-        <w:ind w:left="0"/>
-        <w:rPr>
-          <w:rFonts w:cs="Arial"/>
-        </w:rPr>
-      </w:pPr>
-      <w:r>
-        <w:rPr>
-          <w:rFonts w:cs="Arial"/>
-        </w:rPr>
-        <w:t xml:space="preserve">  </w:t>
+        <w:t xml:space="preserve"> </w:t>
       </w:r>
       <w:proofErr w:type="spellStart"/>
       <w:r>
         <w:rPr>
           <w:rFonts w:cs="Arial"/>
         </w:rPr>
+        <w:t>version</w:t>
+      </w:r>
+      <w:proofErr w:type="spellEnd"/>
+      <w:r>
+        <w:rPr>
+          <w:rFonts w:cs="Arial"/>
+        </w:rPr>
+        <w:t xml:space="preserve">="1.0" </w:t>
+      </w:r>
+      <w:proofErr w:type="spellStart"/>
+      <w:r>
+        <w:rPr>
+          <w:rFonts w:cs="Arial"/>
+        </w:rPr>
+        <w:t>encoding</w:t>
+      </w:r>
+      <w:proofErr w:type="spellEnd"/>
+      <w:r>
+        <w:rPr>
+          <w:rFonts w:cs="Arial"/>
+        </w:rPr>
+        <w:t>="UTF-8"?&gt;</w:t>
+      </w:r>
+    </w:p>
+    <w:p>
+      <w:pPr>
+        <w:pStyle w:val="Textkrper2"/>
+        <w:ind w:left="0"/>
+        <w:rPr>
+          <w:rFonts w:cs="Arial"/>
+        </w:rPr>
+      </w:pPr>
+      <w:r>
+        <w:rPr>
+          <w:rFonts w:cs="Arial"/>
+        </w:rPr>
+        <w:t xml:space="preserve">       2 &lt;!DOCTYPE score-</w:t>
+      </w:r>
+      <w:proofErr w:type="spellStart"/>
+      <w:r>
+        <w:rPr>
+          <w:rFonts w:cs="Arial"/>
+        </w:rPr>
+        <w:t>partwise</w:t>
+      </w:r>
+      <w:proofErr w:type="spellEnd"/>
+      <w:r>
+        <w:rPr>
+          <w:rFonts w:cs="Arial"/>
+        </w:rPr>
+        <w:t xml:space="preserve"> PUBLIC "-//</w:t>
+      </w:r>
+      <w:proofErr w:type="spellStart"/>
+      <w:r>
+        <w:rPr>
+          <w:rFonts w:cs="Arial"/>
+        </w:rPr>
+        <w:t>Recordare</w:t>
+      </w:r>
+      <w:proofErr w:type="spellEnd"/>
+      <w:r>
+        <w:rPr>
+          <w:rFonts w:cs="Arial"/>
+        </w:rPr>
+        <w:t xml:space="preserve">//DTD </w:t>
+      </w:r>
+      <w:proofErr w:type="spellStart"/>
+      <w:r>
+        <w:rPr>
+          <w:rFonts w:cs="Arial"/>
+        </w:rPr>
         <w:t>MusicXML</w:t>
       </w:r>
       <w:proofErr w:type="spellEnd"/>
@@ -2278,1151 +3556,20 @@
         <w:rPr>
           <w:rFonts w:cs="Arial"/>
         </w:rPr>
-        <w:t xml:space="preserve"> kennt nur ganzzahlige Ticks für &lt;</w:t>
+        <w:t xml:space="preserve"> 4.0 </w:t>
       </w:r>
       <w:proofErr w:type="spellStart"/>
       <w:r>
         <w:rPr>
           <w:rFonts w:cs="Arial"/>
         </w:rPr>
-        <w:t>duration</w:t>
+        <w:t>Partwise</w:t>
       </w:r>
       <w:proofErr w:type="spellEnd"/>
       <w:r>
         <w:rPr>
           <w:rFonts w:cs="Arial"/>
         </w:rPr>
-        <w:t>&gt;:</w:t>
-      </w:r>
-    </w:p>
-    <w:p>
-      <w:pPr>
-        <w:pStyle w:val="Textkrper2"/>
-        <w:ind w:left="0"/>
-        <w:rPr>
-          <w:rFonts w:cs="Arial"/>
-        </w:rPr>
-      </w:pPr>
-      <w:r>
-        <w:rPr>
-          <w:rFonts w:cs="Arial"/>
-        </w:rPr>
-        <w:t xml:space="preserve">  &lt;</w:t>
-      </w:r>
-      <w:proofErr w:type="spellStart"/>
-      <w:r>
-        <w:rPr>
-          <w:rFonts w:cs="Arial"/>
-        </w:rPr>
-        <w:t>divisions</w:t>
-      </w:r>
-      <w:proofErr w:type="spellEnd"/>
-      <w:r>
-        <w:rPr>
-          <w:rFonts w:cs="Arial"/>
-        </w:rPr>
-        <w:t>&gt;4&lt;/</w:t>
-      </w:r>
-      <w:proofErr w:type="spellStart"/>
-      <w:r>
-        <w:rPr>
-          <w:rFonts w:cs="Arial"/>
-        </w:rPr>
-        <w:t>divisions</w:t>
-      </w:r>
-      <w:proofErr w:type="spellEnd"/>
-      <w:r>
-        <w:rPr>
-          <w:rFonts w:cs="Arial"/>
-        </w:rPr>
-        <w:t xml:space="preserve">&gt;     </w:t>
-      </w:r>
-      <w:proofErr w:type="gramStart"/>
-      <w:r>
-        <w:rPr>
-          <w:rFonts w:cs="Arial"/>
-        </w:rPr>
-        <w:t>&lt;!--</w:t>
-      </w:r>
-      <w:proofErr w:type="gramEnd"/>
-      <w:r>
-        <w:rPr>
-          <w:rFonts w:cs="Arial"/>
-        </w:rPr>
-        <w:t xml:space="preserve"> 4 Ticks = Viertelnote --&gt;</w:t>
-      </w:r>
-    </w:p>
-    <w:p>
-      <w:pPr>
-        <w:pStyle w:val="Textkrper2"/>
-        <w:ind w:left="0"/>
-        <w:rPr>
-          <w:rFonts w:cs="Arial"/>
-        </w:rPr>
-      </w:pPr>
-      <w:r>
-        <w:rPr>
-          <w:rFonts w:cs="Arial"/>
-        </w:rPr>
-        <w:t xml:space="preserve">  &lt;</w:t>
-      </w:r>
-      <w:proofErr w:type="spellStart"/>
-      <w:r>
-        <w:rPr>
-          <w:rFonts w:cs="Arial"/>
-        </w:rPr>
-        <w:t>duration</w:t>
-      </w:r>
-      <w:proofErr w:type="spellEnd"/>
-      <w:r>
-        <w:rPr>
-          <w:rFonts w:cs="Arial"/>
-        </w:rPr>
-        <w:t>&gt;4&lt;/</w:t>
-      </w:r>
-      <w:proofErr w:type="spellStart"/>
-      <w:r>
-        <w:rPr>
-          <w:rFonts w:cs="Arial"/>
-        </w:rPr>
-        <w:t>duration</w:t>
-      </w:r>
-      <w:proofErr w:type="spellEnd"/>
-      <w:r>
-        <w:rPr>
-          <w:rFonts w:cs="Arial"/>
-        </w:rPr>
-        <w:t xml:space="preserve">&gt;       </w:t>
-      </w:r>
-      <w:proofErr w:type="gramStart"/>
-      <w:r>
-        <w:rPr>
-          <w:rFonts w:cs="Arial"/>
-        </w:rPr>
-        <w:t>&lt;!--</w:t>
-      </w:r>
-      <w:proofErr w:type="gramEnd"/>
-      <w:r>
-        <w:rPr>
-          <w:rFonts w:cs="Arial"/>
-        </w:rPr>
-        <w:t xml:space="preserve"> genau eine Viertelnote --&gt;</w:t>
-      </w:r>
-    </w:p>
-    <w:p>
-      <w:pPr>
-        <w:pStyle w:val="Textkrper2"/>
-        <w:ind w:left="0"/>
-        <w:rPr>
-          <w:rFonts w:cs="Arial"/>
-        </w:rPr>
-      </w:pPr>
-      <w:r>
-        <w:rPr>
-          <w:rFonts w:cs="Arial"/>
-        </w:rPr>
-        <w:t xml:space="preserve">  &lt;</w:t>
-      </w:r>
-      <w:proofErr w:type="spellStart"/>
-      <w:r>
-        <w:rPr>
-          <w:rFonts w:cs="Arial"/>
-        </w:rPr>
-        <w:t>duration</w:t>
-      </w:r>
-      <w:proofErr w:type="spellEnd"/>
-      <w:r>
-        <w:rPr>
-          <w:rFonts w:cs="Arial"/>
-        </w:rPr>
-        <w:t>&gt;5&lt;/</w:t>
-      </w:r>
-      <w:proofErr w:type="spellStart"/>
-      <w:r>
-        <w:rPr>
-          <w:rFonts w:cs="Arial"/>
-        </w:rPr>
-        <w:t>duration</w:t>
-      </w:r>
-      <w:proofErr w:type="spellEnd"/>
-      <w:r>
-        <w:rPr>
-          <w:rFonts w:cs="Arial"/>
-        </w:rPr>
-        <w:t xml:space="preserve">&gt;       </w:t>
-      </w:r>
-      <w:proofErr w:type="gramStart"/>
-      <w:r>
-        <w:rPr>
-          <w:rFonts w:cs="Arial"/>
-        </w:rPr>
-        <w:t>&lt;!--</w:t>
-      </w:r>
-      <w:proofErr w:type="gramEnd"/>
-      <w:r>
-        <w:rPr>
-          <w:rFonts w:cs="Arial"/>
-        </w:rPr>
-        <w:t xml:space="preserve"> 25% länger - viel zu viel! --&gt;</w:t>
-      </w:r>
-    </w:p>
-    <w:p>
-      <w:pPr>
-        <w:pStyle w:val="Textkrper2"/>
-        <w:ind w:left="0"/>
-        <w:rPr>
-          <w:rFonts w:cs="Arial"/>
-        </w:rPr>
-      </w:pPr>
-    </w:p>
-    <w:p>
-      <w:pPr>
-        <w:pStyle w:val="Textkrper2"/>
-        <w:ind w:left="0"/>
-        <w:rPr>
-          <w:rFonts w:cs="Arial"/>
-        </w:rPr>
-      </w:pPr>
-      <w:r>
-        <w:rPr>
-          <w:rFonts w:cs="Arial"/>
-        </w:rPr>
-        <w:t xml:space="preserve">  1% von 4 Ticks = 0,04 Ticks → geht nicht mit </w:t>
-      </w:r>
-      <w:proofErr w:type="spellStart"/>
-      <w:r>
-        <w:rPr>
-          <w:rFonts w:cs="Arial"/>
-        </w:rPr>
-        <w:t>divisions</w:t>
-      </w:r>
-      <w:proofErr w:type="spellEnd"/>
-      <w:r>
-        <w:rPr>
-          <w:rFonts w:cs="Arial"/>
-        </w:rPr>
-        <w:t>=4.</w:t>
-      </w:r>
-    </w:p>
-    <w:p>
-      <w:pPr>
-        <w:pStyle w:val="Textkrper2"/>
-        <w:ind w:left="0"/>
-        <w:rPr>
-          <w:rFonts w:cs="Arial"/>
-        </w:rPr>
-      </w:pPr>
-    </w:p>
-    <w:p>
-      <w:pPr>
-        <w:pStyle w:val="Textkrper2"/>
-        <w:ind w:left="0"/>
-        <w:rPr>
-          <w:rFonts w:cs="Arial"/>
-        </w:rPr>
-      </w:pPr>
-      <w:r>
-        <w:rPr>
-          <w:rFonts w:cs="Arial"/>
-        </w:rPr>
-        <w:t xml:space="preserve">  Lösung: </w:t>
-      </w:r>
-      <w:proofErr w:type="spellStart"/>
-      <w:r>
-        <w:rPr>
-          <w:rFonts w:cs="Arial"/>
-        </w:rPr>
-        <w:t>Divisions</w:t>
-      </w:r>
-      <w:proofErr w:type="spellEnd"/>
-      <w:r>
-        <w:rPr>
-          <w:rFonts w:cs="Arial"/>
-        </w:rPr>
-        <w:t xml:space="preserve"> hochsetzen</w:t>
-      </w:r>
-    </w:p>
-    <w:p>
-      <w:pPr>
-        <w:pStyle w:val="Textkrper2"/>
-        <w:ind w:left="0"/>
-        <w:rPr>
-          <w:rFonts w:cs="Arial"/>
-        </w:rPr>
-      </w:pPr>
-    </w:p>
-    <w:p>
-      <w:pPr>
-        <w:pStyle w:val="Textkrper2"/>
-        <w:ind w:left="0"/>
-        <w:rPr>
-          <w:rFonts w:cs="Arial"/>
-        </w:rPr>
-      </w:pPr>
-      <w:r>
-        <w:rPr>
-          <w:rFonts w:cs="Arial"/>
-        </w:rPr>
-        <w:t xml:space="preserve">  &lt;</w:t>
-      </w:r>
-      <w:proofErr w:type="spellStart"/>
-      <w:r>
-        <w:rPr>
-          <w:rFonts w:cs="Arial"/>
-        </w:rPr>
-        <w:t>divisions</w:t>
-      </w:r>
-      <w:proofErr w:type="spellEnd"/>
-      <w:r>
-        <w:rPr>
-          <w:rFonts w:cs="Arial"/>
-        </w:rPr>
-        <w:t>&gt;480&lt;/</w:t>
-      </w:r>
-      <w:proofErr w:type="spellStart"/>
-      <w:r>
-        <w:rPr>
-          <w:rFonts w:cs="Arial"/>
-        </w:rPr>
-        <w:t>divisions</w:t>
-      </w:r>
-      <w:proofErr w:type="spellEnd"/>
-      <w:r>
-        <w:rPr>
-          <w:rFonts w:cs="Arial"/>
-        </w:rPr>
-        <w:t xml:space="preserve">&gt;   </w:t>
-      </w:r>
-      <w:proofErr w:type="gramStart"/>
-      <w:r>
-        <w:rPr>
-          <w:rFonts w:cs="Arial"/>
-        </w:rPr>
-        <w:t>&lt;!--</w:t>
-      </w:r>
-      <w:proofErr w:type="gramEnd"/>
-      <w:r>
-        <w:rPr>
-          <w:rFonts w:cs="Arial"/>
-        </w:rPr>
-        <w:t xml:space="preserve"> 480 Ticks = eine Viertelnote (DAW-üblich!) --&gt;</w:t>
-      </w:r>
-    </w:p>
-    <w:p>
-      <w:pPr>
-        <w:pStyle w:val="Textkrper2"/>
-        <w:ind w:left="0"/>
-        <w:rPr>
-          <w:rFonts w:cs="Arial"/>
-        </w:rPr>
-      </w:pPr>
-    </w:p>
-    <w:p>
-      <w:pPr>
-        <w:pStyle w:val="Textkrper2"/>
-        <w:ind w:left="0"/>
-        <w:rPr>
-          <w:rFonts w:cs="Arial"/>
-        </w:rPr>
-      </w:pPr>
-      <w:r>
-        <w:rPr>
-          <w:rFonts w:cs="Arial"/>
-        </w:rPr>
-        <w:t xml:space="preserve">  </w:t>
-      </w:r>
-      <w:proofErr w:type="gramStart"/>
-      <w:r>
-        <w:rPr>
-          <w:rFonts w:cs="Arial"/>
-        </w:rPr>
-        <w:t>&lt;!--</w:t>
-      </w:r>
-      <w:proofErr w:type="gramEnd"/>
-      <w:r>
-        <w:rPr>
-          <w:rFonts w:cs="Arial"/>
-        </w:rPr>
-        <w:t xml:space="preserve"> Exakte Viertelnote --&gt;</w:t>
-      </w:r>
-    </w:p>
-    <w:p>
-      <w:pPr>
-        <w:pStyle w:val="Textkrper2"/>
-        <w:ind w:left="0"/>
-        <w:rPr>
-          <w:rFonts w:cs="Arial"/>
-        </w:rPr>
-      </w:pPr>
-      <w:r>
-        <w:rPr>
-          <w:rFonts w:cs="Arial"/>
-        </w:rPr>
-        <w:t xml:space="preserve">  &lt;</w:t>
-      </w:r>
-      <w:proofErr w:type="spellStart"/>
-      <w:r>
-        <w:rPr>
-          <w:rFonts w:cs="Arial"/>
-        </w:rPr>
-        <w:t>duration</w:t>
-      </w:r>
-      <w:proofErr w:type="spellEnd"/>
-      <w:r>
-        <w:rPr>
-          <w:rFonts w:cs="Arial"/>
-        </w:rPr>
-        <w:t>&gt;480&lt;/</w:t>
-      </w:r>
-      <w:proofErr w:type="spellStart"/>
-      <w:r>
-        <w:rPr>
-          <w:rFonts w:cs="Arial"/>
-        </w:rPr>
-        <w:t>duration</w:t>
-      </w:r>
-      <w:proofErr w:type="spellEnd"/>
-      <w:r>
-        <w:rPr>
-          <w:rFonts w:cs="Arial"/>
-        </w:rPr>
-        <w:t>&gt;</w:t>
-      </w:r>
-    </w:p>
-    <w:p>
-      <w:pPr>
-        <w:pStyle w:val="Textkrper2"/>
-        <w:ind w:left="0"/>
-        <w:rPr>
-          <w:rFonts w:cs="Arial"/>
-        </w:rPr>
-      </w:pPr>
-    </w:p>
-    <w:p>
-      <w:pPr>
-        <w:pStyle w:val="Textkrper2"/>
-        <w:ind w:left="0"/>
-        <w:rPr>
-          <w:rFonts w:cs="Arial"/>
-        </w:rPr>
-      </w:pPr>
-      <w:r>
-        <w:rPr>
-          <w:rFonts w:cs="Arial"/>
-        </w:rPr>
-        <w:t xml:space="preserve">  </w:t>
-      </w:r>
-      <w:proofErr w:type="gramStart"/>
-      <w:r>
-        <w:rPr>
-          <w:rFonts w:cs="Arial"/>
-        </w:rPr>
-        <w:t>&lt;!--</w:t>
-      </w:r>
-      <w:proofErr w:type="gramEnd"/>
-      <w:r>
-        <w:rPr>
-          <w:rFonts w:cs="Arial"/>
-        </w:rPr>
-        <w:t xml:space="preserve"> 1% länger --&gt;</w:t>
-      </w:r>
-    </w:p>
-    <w:p>
-      <w:pPr>
-        <w:pStyle w:val="Textkrper2"/>
-        <w:ind w:left="0"/>
-        <w:rPr>
-          <w:rFonts w:cs="Arial"/>
-        </w:rPr>
-      </w:pPr>
-      <w:r>
-        <w:rPr>
-          <w:rFonts w:cs="Arial"/>
-        </w:rPr>
-        <w:t xml:space="preserve">  &lt;</w:t>
-      </w:r>
-      <w:proofErr w:type="spellStart"/>
-      <w:r>
-        <w:rPr>
-          <w:rFonts w:cs="Arial"/>
-        </w:rPr>
-        <w:t>duration</w:t>
-      </w:r>
-      <w:proofErr w:type="spellEnd"/>
-      <w:r>
-        <w:rPr>
-          <w:rFonts w:cs="Arial"/>
-        </w:rPr>
-        <w:t>&gt;485&lt;/</w:t>
-      </w:r>
-      <w:proofErr w:type="spellStart"/>
-      <w:r>
-        <w:rPr>
-          <w:rFonts w:cs="Arial"/>
-        </w:rPr>
-        <w:t>duration</w:t>
-      </w:r>
-      <w:proofErr w:type="spellEnd"/>
-      <w:r>
-        <w:rPr>
-          <w:rFonts w:cs="Arial"/>
-        </w:rPr>
-        <w:t xml:space="preserve">&gt;     </w:t>
-      </w:r>
-      <w:proofErr w:type="gramStart"/>
-      <w:r>
-        <w:rPr>
-          <w:rFonts w:cs="Arial"/>
-        </w:rPr>
-        <w:t>&lt;!--</w:t>
-      </w:r>
-      <w:proofErr w:type="gramEnd"/>
-      <w:r>
-        <w:rPr>
-          <w:rFonts w:cs="Arial"/>
-        </w:rPr>
-        <w:t xml:space="preserve"> 480 × 1.01 = 484.8 ≈ 485 --&gt;</w:t>
-      </w:r>
-    </w:p>
-    <w:p>
-      <w:pPr>
-        <w:pStyle w:val="Textkrper2"/>
-        <w:ind w:left="0"/>
-        <w:rPr>
-          <w:rFonts w:cs="Arial"/>
-        </w:rPr>
-      </w:pPr>
-    </w:p>
-    <w:p>
-      <w:pPr>
-        <w:pStyle w:val="Textkrper2"/>
-        <w:ind w:left="0"/>
-        <w:rPr>
-          <w:rFonts w:cs="Arial"/>
-        </w:rPr>
-      </w:pPr>
-      <w:r>
-        <w:rPr>
-          <w:rFonts w:cs="Arial"/>
-        </w:rPr>
-        <w:t xml:space="preserve">  </w:t>
-      </w:r>
-      <w:proofErr w:type="gramStart"/>
-      <w:r>
-        <w:rPr>
-          <w:rFonts w:cs="Arial"/>
-        </w:rPr>
-        <w:t>&lt;!--</w:t>
-      </w:r>
-      <w:proofErr w:type="gramEnd"/>
-      <w:r>
-        <w:rPr>
-          <w:rFonts w:cs="Arial"/>
-        </w:rPr>
-        <w:t xml:space="preserve"> 5% länger --&gt;</w:t>
-      </w:r>
-    </w:p>
-    <w:p>
-      <w:pPr>
-        <w:pStyle w:val="Textkrper2"/>
-        <w:ind w:left="0"/>
-        <w:rPr>
-          <w:rFonts w:cs="Arial"/>
-        </w:rPr>
-      </w:pPr>
-      <w:r>
-        <w:rPr>
-          <w:rFonts w:cs="Arial"/>
-        </w:rPr>
-        <w:t xml:space="preserve">  &lt;</w:t>
-      </w:r>
-      <w:proofErr w:type="spellStart"/>
-      <w:r>
-        <w:rPr>
-          <w:rFonts w:cs="Arial"/>
-        </w:rPr>
-        <w:t>duration</w:t>
-      </w:r>
-      <w:proofErr w:type="spellEnd"/>
-      <w:r>
-        <w:rPr>
-          <w:rFonts w:cs="Arial"/>
-        </w:rPr>
-        <w:t>&gt;504&lt;/</w:t>
-      </w:r>
-      <w:proofErr w:type="spellStart"/>
-      <w:r>
-        <w:rPr>
-          <w:rFonts w:cs="Arial"/>
-        </w:rPr>
-        <w:t>duration</w:t>
-      </w:r>
-      <w:proofErr w:type="spellEnd"/>
-      <w:r>
-        <w:rPr>
-          <w:rFonts w:cs="Arial"/>
-        </w:rPr>
-        <w:t xml:space="preserve">&gt;     </w:t>
-      </w:r>
-      <w:proofErr w:type="gramStart"/>
-      <w:r>
-        <w:rPr>
-          <w:rFonts w:cs="Arial"/>
-        </w:rPr>
-        <w:t>&lt;!--</w:t>
-      </w:r>
-      <w:proofErr w:type="gramEnd"/>
-      <w:r>
-        <w:rPr>
-          <w:rFonts w:cs="Arial"/>
-        </w:rPr>
-        <w:t xml:space="preserve"> 480 × 1.05 = 504 --&gt;</w:t>
-      </w:r>
-    </w:p>
-    <w:p>
-      <w:pPr>
-        <w:pStyle w:val="Textkrper2"/>
-        <w:ind w:left="0"/>
-        <w:rPr>
-          <w:rFonts w:cs="Arial"/>
-        </w:rPr>
-      </w:pPr>
-    </w:p>
-    <w:p>
-      <w:pPr>
-        <w:pStyle w:val="Textkrper2"/>
-        <w:ind w:left="0"/>
-        <w:rPr>
-          <w:rFonts w:cs="Arial"/>
-        </w:rPr>
-      </w:pPr>
-      <w:r>
-        <w:rPr>
-          <w:rFonts w:cs="Arial"/>
-        </w:rPr>
-        <w:t xml:space="preserve">  </w:t>
-      </w:r>
-      <w:proofErr w:type="gramStart"/>
-      <w:r>
-        <w:rPr>
-          <w:rFonts w:cs="Arial"/>
-        </w:rPr>
-        <w:t>&lt;!--</w:t>
-      </w:r>
-      <w:proofErr w:type="gramEnd"/>
-      <w:r>
-        <w:rPr>
-          <w:rFonts w:cs="Arial"/>
-        </w:rPr>
-        <w:t xml:space="preserve"> 0.5% länger --&gt;</w:t>
-      </w:r>
-    </w:p>
-    <w:p>
-      <w:pPr>
-        <w:pStyle w:val="Textkrper2"/>
-        <w:ind w:left="0"/>
-        <w:rPr>
-          <w:rFonts w:cs="Arial"/>
-        </w:rPr>
-      </w:pPr>
-      <w:r>
-        <w:rPr>
-          <w:rFonts w:cs="Arial"/>
-        </w:rPr>
-        <w:t xml:space="preserve">  &lt;</w:t>
-      </w:r>
-      <w:proofErr w:type="spellStart"/>
-      <w:r>
-        <w:rPr>
-          <w:rFonts w:cs="Arial"/>
-        </w:rPr>
-        <w:t>duration</w:t>
-      </w:r>
-      <w:proofErr w:type="spellEnd"/>
-      <w:r>
-        <w:rPr>
-          <w:rFonts w:cs="Arial"/>
-        </w:rPr>
-        <w:t>&gt;482&lt;/</w:t>
-      </w:r>
-      <w:proofErr w:type="spellStart"/>
-      <w:r>
-        <w:rPr>
-          <w:rFonts w:cs="Arial"/>
-        </w:rPr>
-        <w:t>duration</w:t>
-      </w:r>
-      <w:proofErr w:type="spellEnd"/>
-      <w:r>
-        <w:rPr>
-          <w:rFonts w:cs="Arial"/>
-        </w:rPr>
-        <w:t xml:space="preserve">&gt;     </w:t>
-      </w:r>
-      <w:proofErr w:type="gramStart"/>
-      <w:r>
-        <w:rPr>
-          <w:rFonts w:cs="Arial"/>
-        </w:rPr>
-        <w:t>&lt;!--</w:t>
-      </w:r>
-      <w:proofErr w:type="gramEnd"/>
-      <w:r>
-        <w:rPr>
-          <w:rFonts w:cs="Arial"/>
-        </w:rPr>
-        <w:t xml:space="preserve"> 480 × 1.005 = 482.4 ≈ 482 --&gt;</w:t>
-      </w:r>
-    </w:p>
-    <w:p>
-      <w:pPr>
-        <w:pStyle w:val="Textkrper2"/>
-        <w:ind w:left="0"/>
-        <w:rPr>
-          <w:rFonts w:cs="Arial"/>
-        </w:rPr>
-      </w:pPr>
-    </w:p>
-    <w:p>
-      <w:pPr>
-        <w:pStyle w:val="Textkrper2"/>
-        <w:ind w:left="0"/>
-        <w:rPr>
-          <w:rFonts w:cs="Arial"/>
-        </w:rPr>
-      </w:pPr>
-      <w:r>
-        <w:rPr>
-          <w:rFonts w:cs="Arial"/>
-        </w:rPr>
-        <w:t xml:space="preserve">  Mit </w:t>
-      </w:r>
-      <w:proofErr w:type="spellStart"/>
-      <w:r>
-        <w:rPr>
-          <w:rFonts w:cs="Arial"/>
-        </w:rPr>
-        <w:t>divisions</w:t>
-      </w:r>
-      <w:proofErr w:type="spellEnd"/>
-      <w:r>
-        <w:rPr>
-          <w:rFonts w:cs="Arial"/>
-        </w:rPr>
-        <w:t>=480 ist die kleinste Einheit ~0,2% einer Viertelnote - genau genug.</w:t>
-      </w:r>
-    </w:p>
-    <w:p>
-      <w:pPr>
-        <w:pStyle w:val="Textkrper2"/>
-        <w:ind w:left="0"/>
-        <w:rPr>
-          <w:rFonts w:cs="Arial"/>
-        </w:rPr>
-      </w:pPr>
-    </w:p>
-    <w:p>
-      <w:pPr>
-        <w:pStyle w:val="Textkrper2"/>
-        <w:ind w:left="0"/>
-        <w:rPr>
-          <w:rFonts w:cs="Arial"/>
-        </w:rPr>
-      </w:pPr>
-      <w:r>
-        <w:rPr>
-          <w:rFonts w:cs="Arial"/>
-        </w:rPr>
-        <w:t xml:space="preserve">  In </w:t>
-      </w:r>
-      <w:proofErr w:type="spellStart"/>
-      <w:r>
-        <w:rPr>
-          <w:rFonts w:cs="Arial"/>
-        </w:rPr>
-        <w:t>MuseScore</w:t>
-      </w:r>
-      <w:proofErr w:type="spellEnd"/>
-      <w:r>
-        <w:rPr>
-          <w:rFonts w:cs="Arial"/>
-        </w:rPr>
-        <w:t>: Piano Roll Editor</w:t>
-      </w:r>
-    </w:p>
-    <w:p>
-      <w:pPr>
-        <w:pStyle w:val="Textkrper2"/>
-        <w:ind w:left="0"/>
-        <w:rPr>
-          <w:rFonts w:cs="Arial"/>
-        </w:rPr>
-      </w:pPr>
-    </w:p>
-    <w:p>
-      <w:pPr>
-        <w:pStyle w:val="Textkrper2"/>
-        <w:ind w:left="0"/>
-        <w:rPr>
-          <w:rFonts w:cs="Arial"/>
-        </w:rPr>
-      </w:pPr>
-      <w:r>
-        <w:rPr>
-          <w:rFonts w:cs="Arial"/>
-        </w:rPr>
-        <w:t xml:space="preserve">  1. Ansicht &gt; Piano Roll Editor</w:t>
-      </w:r>
-    </w:p>
-    <w:p>
-      <w:pPr>
-        <w:pStyle w:val="Textkrper2"/>
-        <w:ind w:left="0"/>
-        <w:rPr>
-          <w:rFonts w:cs="Arial"/>
-        </w:rPr>
-      </w:pPr>
-      <w:r>
-        <w:rPr>
-          <w:rFonts w:cs="Arial"/>
-        </w:rPr>
-        <w:t xml:space="preserve">  2. Note anklicken und am rechten Rand ziehen → Länge stufenlos ändern</w:t>
-      </w:r>
-    </w:p>
-    <w:p>
-      <w:pPr>
-        <w:pStyle w:val="Textkrper2"/>
-        <w:ind w:left="0"/>
-        <w:rPr>
-          <w:rFonts w:cs="Arial"/>
-        </w:rPr>
-      </w:pPr>
-      <w:r>
-        <w:rPr>
-          <w:rFonts w:cs="Arial"/>
-        </w:rPr>
-        <w:t xml:space="preserve">  3. Note nach links/rechts verschieben → Timing-Offset (Note kommt etwas früher/später)</w:t>
-      </w:r>
-    </w:p>
-    <w:p>
-      <w:pPr>
-        <w:pStyle w:val="Textkrper2"/>
-        <w:ind w:left="0"/>
-        <w:rPr>
-          <w:rFonts w:cs="Arial"/>
-        </w:rPr>
-      </w:pPr>
-    </w:p>
-    <w:p>
-      <w:pPr>
-        <w:pStyle w:val="Textkrper2"/>
-        <w:ind w:left="0"/>
-        <w:rPr>
-          <w:rFonts w:cs="Arial"/>
-        </w:rPr>
-      </w:pPr>
-      <w:r>
-        <w:rPr>
-          <w:rFonts w:cs="Arial"/>
-        </w:rPr>
-        <w:t xml:space="preserve">  ---</w:t>
-      </w:r>
-    </w:p>
-    <w:p>
-      <w:pPr>
-        <w:pStyle w:val="Textkrper2"/>
-        <w:ind w:left="0"/>
-        <w:rPr>
-          <w:rFonts w:cs="Arial"/>
-        </w:rPr>
-      </w:pPr>
-      <w:r>
-        <w:rPr>
-          <w:rFonts w:cs="Arial"/>
-        </w:rPr>
-        <w:t xml:space="preserve">  Vollständiges Beispiel: Expressives C4</w:t>
-      </w:r>
-    </w:p>
-    <w:p>
-      <w:pPr>
-        <w:pStyle w:val="Textkrper2"/>
-        <w:ind w:left="0"/>
-        <w:rPr>
-          <w:rFonts w:cs="Arial"/>
-        </w:rPr>
-      </w:pPr>
-    </w:p>
-    <w:p>
-      <w:pPr>
-        <w:pStyle w:val="Textkrper2"/>
-        <w:ind w:left="0"/>
-        <w:rPr>
-          <w:rFonts w:cs="Arial"/>
-        </w:rPr>
-      </w:pPr>
-      <w:r>
-        <w:rPr>
-          <w:rFonts w:cs="Arial"/>
-        </w:rPr>
-        <w:t xml:space="preserve">  Ich aktualisiere die Beispieldatei:</w:t>
-      </w:r>
-    </w:p>
-    <w:p>
-      <w:pPr>
-        <w:pStyle w:val="Textkrper2"/>
-        <w:ind w:left="0"/>
-        <w:rPr>
-          <w:rFonts w:cs="Arial"/>
-        </w:rPr>
-      </w:pPr>
-    </w:p>
-    <w:p>
-      <w:pPr>
-        <w:pStyle w:val="Textkrper2"/>
-        <w:ind w:left="0"/>
-        <w:rPr>
-          <w:rFonts w:cs="Arial"/>
-        </w:rPr>
-      </w:pPr>
-      <w:r>
-        <w:rPr>
-          <w:rFonts w:cs="Arial"/>
-        </w:rPr>
-        <w:t xml:space="preserve">● </w:t>
-      </w:r>
-      <w:proofErr w:type="gramStart"/>
-      <w:r>
-        <w:rPr>
-          <w:rFonts w:cs="Arial"/>
-        </w:rPr>
-        <w:t>Write(</w:t>
-      </w:r>
-      <w:proofErr w:type="gramEnd"/>
-      <w:r>
-        <w:rPr>
-          <w:rFonts w:cs="Arial"/>
-        </w:rPr>
-        <w:t>Recherche\</w:t>
-      </w:r>
-      <w:proofErr w:type="spellStart"/>
-      <w:r>
-        <w:rPr>
-          <w:rFonts w:cs="Arial"/>
-        </w:rPr>
-        <w:t>beispiel_micro_expression.musicxml</w:t>
-      </w:r>
-      <w:proofErr w:type="spellEnd"/>
-      <w:r>
-        <w:rPr>
-          <w:rFonts w:cs="Arial"/>
-        </w:rPr>
-        <w:t>)</w:t>
-      </w:r>
-    </w:p>
-    <w:p>
-      <w:pPr>
-        <w:pStyle w:val="Textkrper2"/>
-        <w:ind w:left="0"/>
-        <w:rPr>
-          <w:rFonts w:cs="Arial"/>
-        </w:rPr>
-      </w:pPr>
-      <w:r>
-        <w:rPr>
-          <w:rFonts w:cs="Arial"/>
-        </w:rPr>
-        <w:t xml:space="preserve">  </w:t>
-      </w:r>
-      <w:proofErr w:type="gramStart"/>
-      <w:r>
-        <w:rPr>
-          <w:rFonts w:ascii="Cambria Math" w:hAnsi="Cambria Math" w:cs="Cambria Math"/>
-        </w:rPr>
-        <w:t>⎿</w:t>
-      </w:r>
-      <w:r>
-        <w:rPr>
-          <w:rFonts w:cs="Arial"/>
-        </w:rPr>
-        <w:t xml:space="preserve">  </w:t>
-      </w:r>
-      <w:proofErr w:type="spellStart"/>
-      <w:r>
-        <w:rPr>
-          <w:rFonts w:cs="Arial"/>
-        </w:rPr>
-        <w:t>Wrote</w:t>
-      </w:r>
-      <w:proofErr w:type="spellEnd"/>
-      <w:proofErr w:type="gramEnd"/>
-      <w:r>
-        <w:rPr>
-          <w:rFonts w:cs="Arial"/>
-        </w:rPr>
-        <w:t xml:space="preserve"> 181 </w:t>
-      </w:r>
-      <w:proofErr w:type="spellStart"/>
-      <w:r>
-        <w:rPr>
-          <w:rFonts w:cs="Arial"/>
-        </w:rPr>
-        <w:t>lines</w:t>
-      </w:r>
-      <w:proofErr w:type="spellEnd"/>
-      <w:r>
-        <w:rPr>
-          <w:rFonts w:cs="Arial"/>
-        </w:rPr>
-        <w:t xml:space="preserve"> </w:t>
-      </w:r>
-      <w:proofErr w:type="spellStart"/>
-      <w:r>
-        <w:rPr>
-          <w:rFonts w:cs="Arial"/>
-        </w:rPr>
-        <w:t>to</w:t>
-      </w:r>
-      <w:proofErr w:type="spellEnd"/>
-      <w:r>
-        <w:rPr>
-          <w:rFonts w:cs="Arial"/>
-        </w:rPr>
-        <w:t xml:space="preserve"> Recherche\</w:t>
-      </w:r>
-      <w:proofErr w:type="spellStart"/>
-      <w:r>
-        <w:rPr>
-          <w:rFonts w:cs="Arial"/>
-        </w:rPr>
-        <w:t>beispiel_micro_expression.musicxml</w:t>
-      </w:r>
-      <w:proofErr w:type="spellEnd"/>
-    </w:p>
-    <w:p>
-      <w:pPr>
-        <w:pStyle w:val="Textkrper2"/>
-        <w:ind w:left="0"/>
-        <w:rPr>
-          <w:rFonts w:cs="Arial"/>
-        </w:rPr>
-      </w:pPr>
-      <w:r>
-        <w:rPr>
-          <w:rFonts w:cs="Arial"/>
-        </w:rPr>
-        <w:t xml:space="preserve">       1 &lt;?</w:t>
-      </w:r>
-      <w:proofErr w:type="spellStart"/>
-      <w:r>
-        <w:rPr>
-          <w:rFonts w:cs="Arial"/>
-        </w:rPr>
-        <w:t>xml</w:t>
-      </w:r>
-      <w:proofErr w:type="spellEnd"/>
-      <w:r>
-        <w:rPr>
-          <w:rFonts w:cs="Arial"/>
-        </w:rPr>
-        <w:t xml:space="preserve"> </w:t>
-      </w:r>
-      <w:proofErr w:type="spellStart"/>
-      <w:r>
-        <w:rPr>
-          <w:rFonts w:cs="Arial"/>
-        </w:rPr>
-        <w:t>version</w:t>
-      </w:r>
-      <w:proofErr w:type="spellEnd"/>
-      <w:r>
-        <w:rPr>
-          <w:rFonts w:cs="Arial"/>
-        </w:rPr>
-        <w:t xml:space="preserve">="1.0" </w:t>
-      </w:r>
-      <w:proofErr w:type="spellStart"/>
-      <w:r>
-        <w:rPr>
-          <w:rFonts w:cs="Arial"/>
-        </w:rPr>
-        <w:t>encoding</w:t>
-      </w:r>
-      <w:proofErr w:type="spellEnd"/>
-      <w:r>
-        <w:rPr>
-          <w:rFonts w:cs="Arial"/>
-        </w:rPr>
-        <w:t>="UTF-8"?&gt;</w:t>
-      </w:r>
-    </w:p>
-    <w:p>
-      <w:pPr>
-        <w:pStyle w:val="Textkrper2"/>
-        <w:ind w:left="0"/>
-        <w:rPr>
-          <w:rFonts w:cs="Arial"/>
-        </w:rPr>
-      </w:pPr>
-      <w:r>
-        <w:rPr>
-          <w:rFonts w:cs="Arial"/>
-        </w:rPr>
-        <w:t xml:space="preserve">       2 &lt;!DOCTYPE score-</w:t>
-      </w:r>
-      <w:proofErr w:type="spellStart"/>
-      <w:r>
-        <w:rPr>
-          <w:rFonts w:cs="Arial"/>
-        </w:rPr>
-        <w:t>partwise</w:t>
-      </w:r>
-      <w:proofErr w:type="spellEnd"/>
-      <w:r>
-        <w:rPr>
-          <w:rFonts w:cs="Arial"/>
-        </w:rPr>
-        <w:t xml:space="preserve"> PUBLIC "-//</w:t>
-      </w:r>
-      <w:proofErr w:type="spellStart"/>
-      <w:r>
-        <w:rPr>
-          <w:rFonts w:cs="Arial"/>
-        </w:rPr>
-        <w:t>Recordare</w:t>
-      </w:r>
-      <w:proofErr w:type="spellEnd"/>
-      <w:r>
-        <w:rPr>
-          <w:rFonts w:cs="Arial"/>
-        </w:rPr>
-        <w:t xml:space="preserve">//DTD </w:t>
-      </w:r>
-      <w:proofErr w:type="spellStart"/>
-      <w:r>
-        <w:rPr>
-          <w:rFonts w:cs="Arial"/>
-        </w:rPr>
-        <w:t>MusicXML</w:t>
-      </w:r>
-      <w:proofErr w:type="spellEnd"/>
-      <w:r>
-        <w:rPr>
-          <w:rFonts w:cs="Arial"/>
-        </w:rPr>
-        <w:t xml:space="preserve"> 4.0 </w:t>
-      </w:r>
-      <w:proofErr w:type="spellStart"/>
-      <w:r>
-        <w:rPr>
-          <w:rFonts w:cs="Arial"/>
-        </w:rPr>
-        <w:t>Partwise</w:t>
-      </w:r>
-      <w:proofErr w:type="spellEnd"/>
-      <w:r>
-        <w:rPr>
-          <w:rFonts w:cs="Arial"/>
-        </w:rPr>
         <w:t>//EN"</w:t>
       </w:r>
     </w:p>
@@ -3453,21 +3600,7 @@
         <w:rPr>
           <w:rFonts w:cs="Arial"/>
         </w:rPr>
-        <w:t xml:space="preserve">       4 </w:t>
-      </w:r>
-      <w:proofErr w:type="gramStart"/>
-      <w:r>
-        <w:rPr>
-          <w:rFonts w:cs="Arial"/>
-        </w:rPr>
-        <w:t>&lt;!-</w:t>
-      </w:r>
-      <w:proofErr w:type="gramEnd"/>
-      <w:r>
-        <w:rPr>
-          <w:rFonts w:cs="Arial"/>
-        </w:rPr>
-        <w:t>-</w:t>
+        <w:t xml:space="preserve">       4 &lt;!--</w:t>
       </w:r>
     </w:p>
     <w:p>
@@ -3659,11 +3792,11 @@
       <w:pPr>
         <w:pStyle w:val="berschrift2"/>
       </w:pPr>
-      <w:bookmarkStart w:id="2" w:name="_Toc226857188"/>
+      <w:bookmarkStart w:id="4" w:name="_Toc226930316"/>
       <w:r>
         <w:t>Ideen</w:t>
       </w:r>
-      <w:bookmarkEnd w:id="2"/>
+      <w:bookmarkEnd w:id="4"/>
     </w:p>
     <w:p>
       <w:pPr>
@@ -3918,27 +4051,13 @@
         <w:rPr>
           <w:rFonts w:cs="Arial"/>
         </w:rPr>
-        <w:t>(um ein paar Cent</w:t>
-      </w:r>
-      <w:proofErr w:type="gramStart"/>
-      <w:r>
-        <w:rPr>
-          <w:rFonts w:cs="Arial"/>
-        </w:rPr>
-        <w:t xml:space="preserve">) </w:t>
-      </w:r>
-      <w:r>
-        <w:rPr>
-          <w:rFonts w:cs="Arial"/>
-        </w:rPr>
-        <w:t>,</w:t>
-      </w:r>
-      <w:proofErr w:type="gramEnd"/>
-      <w:r>
-        <w:rPr>
-          <w:rFonts w:cs="Arial"/>
-        </w:rPr>
-        <w:t xml:space="preserve"> z.B. durch Midi Keyboard</w:t>
+        <w:t xml:space="preserve">(um ein paar Cent) </w:t>
+      </w:r>
+      <w:r>
+        <w:rPr>
+          <w:rFonts w:cs="Arial"/>
+        </w:rPr>
+        <w:t>, z.B. durch Midi Keyboard</w:t>
       </w:r>
     </w:p>
     <w:p>
@@ -5390,35 +5509,7 @@
         <w:rPr>
           <w:rFonts w:cs="Arial"/>
         </w:rPr>
-        <w:t xml:space="preserve">meinem UI möchte ich Farbwerte nach Lautstärke. </w:t>
-      </w:r>
-      <w:proofErr w:type="gramStart"/>
-      <w:r>
-        <w:rPr>
-          <w:rFonts w:cs="Arial"/>
-        </w:rPr>
-        <w:t>Default :</w:t>
-      </w:r>
-      <w:proofErr w:type="gramEnd"/>
-      <w:r>
-        <w:rPr>
-          <w:rFonts w:cs="Arial"/>
-        </w:rPr>
-        <w:t xml:space="preserve"> Rot, leiser= Farbskale rot-gelb, lauter= Farbskala </w:t>
-      </w:r>
-      <w:proofErr w:type="gramStart"/>
-      <w:r>
-        <w:rPr>
-          <w:rFonts w:cs="Arial"/>
-        </w:rPr>
-        <w:t>bis  Blau</w:t>
-      </w:r>
-      <w:proofErr w:type="gramEnd"/>
-      <w:r>
-        <w:rPr>
-          <w:rFonts w:cs="Arial"/>
-        </w:rPr>
-        <w:t xml:space="preserve">. Die Länge der </w:t>
+        <w:t xml:space="preserve">meinem UI möchte ich Farbwerte nach Lautstärke. Default : Rot, leiser= Farbskale rot-gelb, lauter= Farbskala bis  Blau. Die Länge der </w:t>
       </w:r>
       <w:proofErr w:type="spellStart"/>
       <w:r>
@@ -5446,21 +5537,7 @@
         <w:rPr>
           <w:rFonts w:cs="Arial"/>
         </w:rPr>
-        <w:t xml:space="preserve"> des Taktes, z.B. doppelt so </w:t>
-      </w:r>
-      <w:proofErr w:type="gramStart"/>
-      <w:r>
-        <w:rPr>
-          <w:rFonts w:cs="Arial"/>
-        </w:rPr>
-        <w:t>lang</w:t>
-      </w:r>
-      <w:proofErr w:type="gramEnd"/>
-      <w:r>
-        <w:rPr>
-          <w:rFonts w:cs="Arial"/>
-        </w:rPr>
-        <w:t xml:space="preserve"> wenn der Takt länger ist.  wenn es Tonverschiebungen gibt, soll es die </w:t>
+        <w:t xml:space="preserve"> des Taktes, z.B. doppelt so lang wenn der Takt länger ist.  wenn es Tonverschiebungen gibt, soll es die </w:t>
       </w:r>
       <w:proofErr w:type="spellStart"/>
       <w:r>
@@ -5514,14 +5591,7 @@
         <w:rPr>
           <w:rFonts w:cs="Arial"/>
         </w:rPr>
-        <w:t xml:space="preserve">, kreis nach unten/oben falls die Verschiebung gleitend ist. Falls die Notenlänge innerhalb </w:t>
-      </w:r>
-      <w:proofErr w:type="gramStart"/>
-      <w:r>
-        <w:rPr>
-          <w:rFonts w:cs="Arial"/>
-        </w:rPr>
-        <w:t xml:space="preserve">eines  </w:t>
+        <w:t xml:space="preserve">, kreis nach unten/oben falls die Verschiebung gleitend ist. Falls die Notenlänge innerhalb eines  </w:t>
       </w:r>
       <w:proofErr w:type="spellStart"/>
       <w:r>
@@ -5531,7 +5601,6 @@
         <w:t>taktes</w:t>
       </w:r>
       <w:proofErr w:type="spellEnd"/>
-      <w:proofErr w:type="gramEnd"/>
       <w:r>
         <w:rPr>
           <w:rFonts w:cs="Arial"/>
@@ -5606,35 +5675,7 @@
         <w:rPr>
           <w:rFonts w:cs="Arial"/>
         </w:rPr>
-        <w:t xml:space="preserve"> möchte ich erstmal </w:t>
-      </w:r>
-      <w:proofErr w:type="gramStart"/>
-      <w:r>
-        <w:rPr>
-          <w:rFonts w:cs="Arial"/>
-        </w:rPr>
-        <w:t>die  basislänge</w:t>
-      </w:r>
-      <w:proofErr w:type="gramEnd"/>
-      <w:r>
-        <w:rPr>
-          <w:rFonts w:cs="Arial"/>
-        </w:rPr>
-        <w:t xml:space="preserve"> der Takte mit Keyboard eingeben können. Die Länge der Noten / Lautstärke eines bestehenden Midi </w:t>
-      </w:r>
-      <w:proofErr w:type="gramStart"/>
-      <w:r>
-        <w:rPr>
-          <w:rFonts w:cs="Arial"/>
-        </w:rPr>
-        <w:t>Sheets  während</w:t>
-      </w:r>
-      <w:proofErr w:type="gramEnd"/>
-      <w:r>
-        <w:rPr>
-          <w:rFonts w:cs="Arial"/>
-        </w:rPr>
-        <w:t xml:space="preserve"> des </w:t>
+        <w:t xml:space="preserve"> möchte ich erstmal die  basislänge der Takte mit Keyboard eingeben können. Die Länge der Noten / Lautstärke eines bestehenden Midi Sheets  während des </w:t>
       </w:r>
       <w:proofErr w:type="spellStart"/>
       <w:r>
@@ -5662,21 +5703,7 @@
         <w:rPr>
           <w:rFonts w:cs="Arial"/>
         </w:rPr>
-        <w:t xml:space="preserve">. z.B. das Midi spielt ab, ich setzte auf dem Keyboard die Lautstärke, das </w:t>
-      </w:r>
-      <w:proofErr w:type="gramStart"/>
-      <w:r>
-        <w:rPr>
-          <w:rFonts w:cs="Arial"/>
-        </w:rPr>
-        <w:t>wird  dann</w:t>
-      </w:r>
-      <w:proofErr w:type="gramEnd"/>
-      <w:r>
-        <w:rPr>
-          <w:rFonts w:cs="Arial"/>
-        </w:rPr>
-        <w:t xml:space="preserve"> gesetzt im </w:t>
+        <w:t xml:space="preserve">. z.B. das Midi spielt ab, ich setzte auf dem Keyboard die Lautstärke, das wird  dann gesetzt im </w:t>
       </w:r>
       <w:proofErr w:type="spellStart"/>
       <w:r>
@@ -5718,21 +5745,7 @@
         <w:rPr>
           <w:rFonts w:cs="Arial"/>
         </w:rPr>
-        <w:t xml:space="preserve"> durch eine Taste, die zacken werden gesetzt.  ich brauche noch: Noten verschieben, lösche, die Farben der Noten / Linien ändern (also Länge der Note, </w:t>
-      </w:r>
-      <w:proofErr w:type="gramStart"/>
-      <w:r>
-        <w:rPr>
-          <w:rFonts w:cs="Arial"/>
-        </w:rPr>
-        <w:t>Lautstärke)  ,</w:t>
-      </w:r>
-      <w:proofErr w:type="gramEnd"/>
-      <w:r>
-        <w:rPr>
-          <w:rFonts w:cs="Arial"/>
-        </w:rPr>
-        <w:t xml:space="preserve"> die Zacken ändern. wie realistisch ist das?</w:t>
+        <w:t xml:space="preserve"> durch eine Taste, die zacken werden gesetzt.  ich brauche noch: Noten verschieben, lösche, die Farben der Noten / Linien ändern (also Länge der Note, Lautstärke)  , die Zacken ändern. wie realistisch ist das?</w:t>
       </w:r>
     </w:p>
     <w:p>
@@ -5748,11 +5761,11 @@
       <w:pPr>
         <w:pStyle w:val="berschrift2"/>
       </w:pPr>
-      <w:bookmarkStart w:id="3" w:name="_Toc226857189"/>
+      <w:bookmarkStart w:id="5" w:name="_Toc226930317"/>
       <w:r>
         <w:t>Plan</w:t>
       </w:r>
-      <w:bookmarkEnd w:id="3"/>
+      <w:bookmarkEnd w:id="5"/>
     </w:p>
     <w:p>
       <w:pPr>
@@ -5899,15 +5912,7 @@
         <w:ind w:left="0"/>
       </w:pPr>
       <w:r>
-        <w:t xml:space="preserve">  Takt 1 (</w:t>
-      </w:r>
-      <w:proofErr w:type="gramStart"/>
-      <w:r>
-        <w:t xml:space="preserve">kurz)   </w:t>
-      </w:r>
-      <w:proofErr w:type="gramEnd"/>
-      <w:r>
-        <w:t xml:space="preserve">       Takt 2 (doppelt so lang)</w:t>
+        <w:t xml:space="preserve">  Takt 1 (kurz)          Takt 2 (doppelt so lang)</w:t>
       </w:r>
     </w:p>
     <w:p>
@@ -5964,15 +5969,7 @@
         <w:ind w:left="0"/>
       </w:pPr>
       <w:r>
-        <w:t xml:space="preserve">  Cent hoch (Zacke):      ●───/\───● </w:t>
-      </w:r>
-      <w:proofErr w:type="gramStart"/>
-      <w:r>
-        <w:t xml:space="preserve">   (</w:t>
-      </w:r>
-      <w:proofErr w:type="gramEnd"/>
-      <w:r>
-        <w:t>spitze Zacke = sofort)</w:t>
+        <w:t xml:space="preserve">  Cent hoch (Zacke):      ●───/\───●    (spitze Zacke = sofort)</w:t>
       </w:r>
     </w:p>
     <w:p>
@@ -6011,15 +6008,7 @@
         <w:t>────●</w:t>
       </w:r>
       <w:r>
-        <w:t xml:space="preserve"> </w:t>
-      </w:r>
-      <w:proofErr w:type="gramStart"/>
-      <w:r>
-        <w:t xml:space="preserve">   (</w:t>
-      </w:r>
-      <w:proofErr w:type="gramEnd"/>
-      <w:r>
-        <w:t>Bogen = Glissando)</w:t>
+        <w:t xml:space="preserve">    (Bogen = Glissando)</w:t>
       </w:r>
     </w:p>
     <w:p>
@@ -6064,15 +6053,7 @@
         <w:ind w:left="0"/>
       </w:pPr>
       <w:r>
-        <w:t xml:space="preserve">                          ●─══●══──● </w:t>
-      </w:r>
-      <w:proofErr w:type="gramStart"/>
-      <w:r>
-        <w:t xml:space="preserve">   (</w:t>
-      </w:r>
-      <w:proofErr w:type="gramEnd"/>
-      <w:r>
-        <w:t>═ = gelb-rot gefärbt)</w:t>
+        <w:t xml:space="preserve">                          ●─══●══──●    (═ = gelb-rot gefärbt)</w:t>
       </w:r>
     </w:p>
     <w:p>
@@ -6096,15 +6077,7 @@
         <w:ind w:left="0"/>
       </w:pPr>
       <w:r>
-        <w:t xml:space="preserve">                          ●─══●══──● </w:t>
-      </w:r>
-      <w:proofErr w:type="gramStart"/>
-      <w:r>
-        <w:t xml:space="preserve">   (</w:t>
-      </w:r>
-      <w:proofErr w:type="gramEnd"/>
-      <w:r>
-        <w:t>═ = blau gefärbt)</w:t>
+        <w:t xml:space="preserve">                          ●─══●══──●    (═ = blau gefärbt)</w:t>
       </w:r>
     </w:p>
     <w:p>
@@ -6216,15 +6189,7 @@
         <w:ind w:left="0"/>
       </w:pPr>
       <w:r>
-        <w:t xml:space="preserve">  │ Farbe nach Velocity (rot-gelb-</w:t>
-      </w:r>
-      <w:proofErr w:type="gramStart"/>
-      <w:r>
-        <w:t xml:space="preserve">blau)   </w:t>
-      </w:r>
-      <w:proofErr w:type="gramEnd"/>
-      <w:r>
-        <w:t xml:space="preserve">        │ 2 Stunden        │    Einfach    │</w:t>
+        <w:t xml:space="preserve">  │ Farbe nach Velocity (rot-gelb-blau)           │ 2 Stunden        │    Einfach    │</w:t>
       </w:r>
     </w:p>
     <w:p>
@@ -6299,17 +6264,12 @@
         <w:t xml:space="preserve">  │ Abspielen (</w:t>
       </w:r>
       <w:proofErr w:type="spellStart"/>
-      <w:proofErr w:type="gramStart"/>
       <w:r>
         <w:t>fluidsynth</w:t>
       </w:r>
       <w:proofErr w:type="spellEnd"/>
       <w:r>
-        <w:t xml:space="preserve">)   </w:t>
-      </w:r>
-      <w:proofErr w:type="gramEnd"/>
-      <w:r>
-        <w:t xml:space="preserve">                     │ 0.5 Tage         │    Einfach    │</w:t>
+        <w:t>)                        │ 0.5 Tage         │    Einfach    │</w:t>
       </w:r>
     </w:p>
     <w:p>
@@ -6382,15 +6342,7 @@
         <w:ind w:left="0"/>
       </w:pPr>
       <w:r>
-        <w:t xml:space="preserve">  │ Note verschieben (</w:t>
-      </w:r>
-      <w:proofErr w:type="gramStart"/>
-      <w:r>
-        <w:t xml:space="preserve">Drag)   </w:t>
-      </w:r>
-      <w:proofErr w:type="gramEnd"/>
-      <w:r>
-        <w:t xml:space="preserve">                    │ 1 Tag            │    Mittel     │</w:t>
+        <w:t xml:space="preserve">  │ Note verschieben (Drag)                       │ 1 Tag            │    Mittel     │</w:t>
       </w:r>
     </w:p>
     <w:p>
@@ -6462,15 +6414,7 @@
         <w:ind w:left="0"/>
       </w:pPr>
       <w:r>
-        <w:t xml:space="preserve">  │ </w:t>
-      </w:r>
-      <w:proofErr w:type="gramStart"/>
-      <w:r>
-        <w:t>Gesamt</w:t>
-      </w:r>
-      <w:proofErr w:type="gramEnd"/>
-      <w:r>
-        <w:t xml:space="preserve">                                        │ ~7-8 Arbeitstage │               │</w:t>
+        <w:t xml:space="preserve">  │ Gesamt                                        │ ~7-8 Arbeitstage │               │</w:t>
       </w:r>
     </w:p>
     <w:p>
@@ -6576,20 +6520,404 @@
     </w:p>
     <w:p>
       <w:pPr>
+        <w:pStyle w:val="Textkrper2"/>
+        <w:ind w:left="0"/>
+        <w:rPr>
+          <w:rFonts w:cs="Arial"/>
+        </w:rPr>
+      </w:pPr>
+      <w:r>
+        <w:rPr>
+          <w:rFonts w:cs="Arial"/>
+        </w:rPr>
+        <w:drawing>
+          <wp:inline distT="0" distB="0" distL="0" distR="0" wp14:anchorId="076842B0" wp14:editId="77E9AEE8">
+            <wp:extent cx="6119495" cy="1818005"/>
+            <wp:effectExtent l="0" t="0" r="0" b="0"/>
+            <wp:docPr id="1609009681" name="Grafik 1"/>
+            <wp:cNvGraphicFramePr>
+              <a:graphicFrameLocks xmlns:a="http://schemas.openxmlformats.org/drawingml/2006/main" noChangeAspect="1"/>
+            </wp:cNvGraphicFramePr>
+            <a:graphic xmlns:a="http://schemas.openxmlformats.org/drawingml/2006/main">
+              <a:graphicData uri="http://schemas.openxmlformats.org/drawingml/2006/picture">
+                <pic:pic xmlns:pic="http://schemas.openxmlformats.org/drawingml/2006/picture">
+                  <pic:nvPicPr>
+                    <pic:cNvPr id="1609009681" name=""/>
+                    <pic:cNvPicPr/>
+                  </pic:nvPicPr>
+                  <pic:blipFill>
+                    <a:blip r:embed="rId26"/>
+                    <a:stretch>
+                      <a:fillRect/>
+                    </a:stretch>
+                  </pic:blipFill>
+                  <pic:spPr>
+                    <a:xfrm>
+                      <a:off x="0" y="0"/>
+                      <a:ext cx="6119495" cy="1818005"/>
+                    </a:xfrm>
+                    <a:prstGeom prst="rect">
+                      <a:avLst/>
+                    </a:prstGeom>
+                  </pic:spPr>
+                </pic:pic>
+              </a:graphicData>
+            </a:graphic>
+          </wp:inline>
+        </w:drawing>
+      </w:r>
+    </w:p>
+    <w:p>
+      <w:pPr>
+        <w:pStyle w:val="Textkrper2"/>
+        <w:ind w:left="0"/>
+        <w:rPr>
+          <w:rFonts w:cs="Arial"/>
+        </w:rPr>
+      </w:pPr>
+    </w:p>
+    <w:p>
+      <w:pPr>
+        <w:pStyle w:val="Textkrper2"/>
+        <w:ind w:left="0"/>
+        <w:rPr>
+          <w:rFonts w:cs="Arial"/>
+        </w:rPr>
+      </w:pPr>
+      <w:r>
+        <w:rPr>
+          <w:rFonts w:cs="Arial"/>
+        </w:rPr>
+        <w:lastRenderedPageBreak/>
+        <w:drawing>
+          <wp:inline distT="0" distB="0" distL="0" distR="0" wp14:anchorId="1BB36139" wp14:editId="1FF894F7">
+            <wp:extent cx="6119495" cy="4515485"/>
+            <wp:effectExtent l="0" t="0" r="0" b="0"/>
+            <wp:docPr id="206107152" name="Grafik 1"/>
+            <wp:cNvGraphicFramePr>
+              <a:graphicFrameLocks xmlns:a="http://schemas.openxmlformats.org/drawingml/2006/main" noChangeAspect="1"/>
+            </wp:cNvGraphicFramePr>
+            <a:graphic xmlns:a="http://schemas.openxmlformats.org/drawingml/2006/main">
+              <a:graphicData uri="http://schemas.openxmlformats.org/drawingml/2006/picture">
+                <pic:pic xmlns:pic="http://schemas.openxmlformats.org/drawingml/2006/picture">
+                  <pic:nvPicPr>
+                    <pic:cNvPr id="206107152" name=""/>
+                    <pic:cNvPicPr/>
+                  </pic:nvPicPr>
+                  <pic:blipFill>
+                    <a:blip r:embed="rId27"/>
+                    <a:stretch>
+                      <a:fillRect/>
+                    </a:stretch>
+                  </pic:blipFill>
+                  <pic:spPr>
+                    <a:xfrm>
+                      <a:off x="0" y="0"/>
+                      <a:ext cx="6119495" cy="4515485"/>
+                    </a:xfrm>
+                    <a:prstGeom prst="rect">
+                      <a:avLst/>
+                    </a:prstGeom>
+                  </pic:spPr>
+                </pic:pic>
+              </a:graphicData>
+            </a:graphic>
+          </wp:inline>
+        </w:drawing>
+      </w:r>
+    </w:p>
+    <w:p>
+      <w:pPr>
+        <w:pStyle w:val="Textkrper2"/>
+        <w:ind w:left="0"/>
+        <w:rPr>
+          <w:rFonts w:cs="Arial"/>
+        </w:rPr>
+      </w:pPr>
+    </w:p>
+    <w:p>
+      <w:pPr>
         <w:pStyle w:val="berschrift1"/>
       </w:pPr>
-      <w:bookmarkStart w:id="4" w:name="_Toc475330265"/>
-      <w:bookmarkStart w:id="5" w:name="_Toc226857190"/>
+      <w:bookmarkStart w:id="6" w:name="_Toc475330265"/>
+      <w:bookmarkStart w:id="7" w:name="_Toc226930318"/>
+      <w:r>
+        <w:lastRenderedPageBreak/>
+        <w:t>Architektur</w:t>
+      </w:r>
+      <w:bookmarkEnd w:id="7"/>
+    </w:p>
+    <w:p>
+      <w:pPr>
+        <w:pStyle w:val="Textkrper"/>
+        <w:ind w:left="0"/>
+      </w:pPr>
+      <w:r>
+        <w:t>Tempo</w:t>
+      </w:r>
+    </w:p>
+    <w:p>
+      <w:pPr>
+        <w:pStyle w:val="Textkrper"/>
+      </w:pPr>
+    </w:p>
+    <w:p>
+      <w:pPr>
+        <w:pStyle w:val="Textkrper"/>
+        <w:ind w:left="0"/>
+      </w:pPr>
+      <w:r>
+        <w:t xml:space="preserve">  1. </w:t>
+      </w:r>
+      <w:proofErr w:type="spellStart"/>
+      <w:r>
+        <w:t>piece.tempos</w:t>
+      </w:r>
+      <w:proofErr w:type="spellEnd"/>
+      <w:r>
+        <w:t>[0].bpm = Globales Tempo (z.B. 100 BPM)</w:t>
+      </w:r>
+    </w:p>
+    <w:p>
+      <w:pPr>
+        <w:pStyle w:val="Textkrper"/>
+        <w:ind w:left="0"/>
+      </w:pPr>
+      <w:r>
+        <w:t xml:space="preserve">  2. </w:t>
+      </w:r>
+      <w:proofErr w:type="spellStart"/>
+      <w:r>
+        <w:t>measure.tempo.bpm</w:t>
+      </w:r>
+      <w:proofErr w:type="spellEnd"/>
+      <w:r>
+        <w:t xml:space="preserve"> = Per-Takt-Tempo (vom </w:t>
+      </w:r>
+      <w:proofErr w:type="spellStart"/>
+      <w:r>
+        <w:t>MusicXML</w:t>
+      </w:r>
+      <w:proofErr w:type="spellEnd"/>
+      <w:r>
+        <w:t>-Import gesetzt)</w:t>
+      </w:r>
+    </w:p>
+    <w:p>
+      <w:pPr>
+        <w:pStyle w:val="Textkrper"/>
+        <w:ind w:left="0"/>
+      </w:pPr>
+      <w:r>
+        <w:t xml:space="preserve">  3. Note hat KEIN eigenes Tempo - der Dauer-Slider ändert </w:t>
+      </w:r>
+      <w:proofErr w:type="spellStart"/>
+      <w:r>
+        <w:t>note.expression.duration_deviation</w:t>
+      </w:r>
+      <w:proofErr w:type="spellEnd"/>
+      <w:r>
+        <w:t>, nicht das Tempo</w:t>
+      </w:r>
+    </w:p>
+    <w:p>
+      <w:pPr>
+        <w:pStyle w:val="Textkrper"/>
+        <w:ind w:left="0"/>
+      </w:pPr>
+    </w:p>
+    <w:p>
+      <w:pPr>
+        <w:pStyle w:val="Textkrper"/>
+        <w:ind w:left="0"/>
+      </w:pPr>
+      <w:r>
+        <w:t xml:space="preserve">  Das Problem: Der </w:t>
+      </w:r>
+      <w:proofErr w:type="spellStart"/>
+      <w:r>
+        <w:t>tempo_changed</w:t>
+      </w:r>
+      <w:proofErr w:type="spellEnd"/>
+      <w:r>
+        <w:t xml:space="preserve"> Signal vom </w:t>
+      </w:r>
+      <w:proofErr w:type="spellStart"/>
+      <w:r>
+        <w:t>PropertiesPanel</w:t>
+      </w:r>
+      <w:proofErr w:type="spellEnd"/>
+      <w:r>
+        <w:t xml:space="preserve"> wird ausgelöst wenn:</w:t>
+      </w:r>
+    </w:p>
+    <w:p>
+      <w:pPr>
+        <w:pStyle w:val="Textkrper"/>
+        <w:ind w:left="0"/>
+      </w:pPr>
+      <w:r>
+        <w:t xml:space="preserve">  - Ein Takt selektiert ist UND der User das Tempo-</w:t>
+      </w:r>
+      <w:proofErr w:type="spellStart"/>
+      <w:r>
+        <w:t>Spinbox</w:t>
+      </w:r>
+      <w:proofErr w:type="spellEnd"/>
+      <w:r>
+        <w:t xml:space="preserve"> ändert → sollte NUR diesen Takt ändern</w:t>
+      </w:r>
+    </w:p>
+    <w:p>
+      <w:pPr>
+        <w:pStyle w:val="Textkrper"/>
+        <w:ind w:left="0"/>
+      </w:pPr>
+      <w:r>
+        <w:t xml:space="preserve">  - Kein Takt selektiert (Tempo-Anzeige geklickt) → sollte globales Tempo ändern</w:t>
+      </w:r>
+    </w:p>
+    <w:p>
+      <w:pPr>
+        <w:pStyle w:val="Textkrper"/>
+        <w:ind w:left="0"/>
+      </w:pPr>
+    </w:p>
+    <w:p>
+      <w:pPr>
+        <w:pStyle w:val="Textkrper"/>
+        <w:ind w:left="0"/>
+      </w:pPr>
+      <w:r>
+        <w:t xml:space="preserve">  Aber: Wenn eine Note selektiert ist, zeigt das Panel die Note-Seite (Index 1), NICHT die Tempo-Seite (Index 2). Also</w:t>
+      </w:r>
+    </w:p>
+    <w:p>
+      <w:pPr>
+        <w:pStyle w:val="Textkrper"/>
+        <w:ind w:left="0"/>
+      </w:pPr>
+      <w:r>
+        <w:t xml:space="preserve">  sollte Tempo-Änderung bei Note-Selektion gar nicht möglich sein... Es sei denn der User wechselt manuell zwischen den</w:t>
+      </w:r>
+    </w:p>
+    <w:p>
+      <w:pPr>
+        <w:pStyle w:val="Textkrper"/>
+        <w:ind w:left="0"/>
+      </w:pPr>
+      <w:r>
+        <w:t xml:space="preserve">  Seiten.</w:t>
+      </w:r>
+    </w:p>
+    <w:p>
+      <w:pPr>
+        <w:pStyle w:val="Textkrper"/>
+        <w:ind w:left="0"/>
+      </w:pPr>
+    </w:p>
+    <w:p>
+      <w:pPr>
+        <w:pStyle w:val="berschrift2"/>
+      </w:pPr>
+      <w:bookmarkStart w:id="8" w:name="_Toc226930319"/>
+      <w:r>
+        <w:t xml:space="preserve">Python </w:t>
+      </w:r>
+      <w:proofErr w:type="spellStart"/>
+      <w:r>
+        <w:t>framework</w:t>
+      </w:r>
+      <w:proofErr w:type="spellEnd"/>
+    </w:p>
+    <w:p>
+      <w:pPr>
+        <w:pStyle w:val="Textkrper2"/>
+        <w:ind w:left="0"/>
+      </w:pPr>
+      <w:r>
+        <w:t>PySide6</w:t>
+      </w:r>
+    </w:p>
+    <w:p>
+      <w:pPr>
+        <w:pStyle w:val="Textkrper2"/>
+        <w:ind w:left="0"/>
+      </w:pPr>
+    </w:p>
+    <w:p>
+      <w:pPr>
+        <w:pStyle w:val="berschrift2"/>
+      </w:pPr>
+      <w:r>
+        <w:t>Sounds</w:t>
+      </w:r>
+      <w:bookmarkEnd w:id="8"/>
+    </w:p>
+    <w:p>
+      <w:pPr>
+        <w:pStyle w:val="Textkrper"/>
+        <w:ind w:left="0"/>
+      </w:pPr>
+      <w:r>
+        <w:drawing>
+          <wp:inline distT="0" distB="0" distL="0" distR="0" wp14:anchorId="46F6DD59" wp14:editId="5233AB50">
+            <wp:extent cx="6119495" cy="1892935"/>
+            <wp:effectExtent l="0" t="0" r="0" b="0"/>
+            <wp:docPr id="116415665" name="Grafik 1"/>
+            <wp:cNvGraphicFramePr>
+              <a:graphicFrameLocks xmlns:a="http://schemas.openxmlformats.org/drawingml/2006/main" noChangeAspect="1"/>
+            </wp:cNvGraphicFramePr>
+            <a:graphic xmlns:a="http://schemas.openxmlformats.org/drawingml/2006/main">
+              <a:graphicData uri="http://schemas.openxmlformats.org/drawingml/2006/picture">
+                <pic:pic xmlns:pic="http://schemas.openxmlformats.org/drawingml/2006/picture">
+                  <pic:nvPicPr>
+                    <pic:cNvPr id="116415665" name=""/>
+                    <pic:cNvPicPr/>
+                  </pic:nvPicPr>
+                  <pic:blipFill>
+                    <a:blip r:embed="rId28"/>
+                    <a:stretch>
+                      <a:fillRect/>
+                    </a:stretch>
+                  </pic:blipFill>
+                  <pic:spPr>
+                    <a:xfrm>
+                      <a:off x="0" y="0"/>
+                      <a:ext cx="6119495" cy="1892935"/>
+                    </a:xfrm>
+                    <a:prstGeom prst="rect">
+                      <a:avLst/>
+                    </a:prstGeom>
+                  </pic:spPr>
+                </pic:pic>
+              </a:graphicData>
+            </a:graphic>
+          </wp:inline>
+        </w:drawing>
+      </w:r>
+    </w:p>
+    <w:p>
+      <w:pPr>
+        <w:pStyle w:val="Textkrper"/>
+        <w:ind w:left="0"/>
+      </w:pPr>
+    </w:p>
+    <w:p>
+      <w:pPr>
+        <w:pStyle w:val="berschrift1"/>
+      </w:pPr>
+      <w:bookmarkStart w:id="9" w:name="_Toc226930320"/>
       <w:r>
         <w:lastRenderedPageBreak/>
         <w:t>Links</w:t>
       </w:r>
-      <w:bookmarkEnd w:id="4"/>
-      <w:bookmarkEnd w:id="5"/>
+      <w:bookmarkEnd w:id="6"/>
+      <w:bookmarkEnd w:id="9"/>
     </w:p>
     <w:sectPr>
-      <w:headerReference w:type="default" r:id="rId26"/>
-      <w:footerReference w:type="default" r:id="rId27"/>
+      <w:headerReference w:type="default" r:id="rId29"/>
+      <w:footerReference w:type="default" r:id="rId30"/>
       <w:pgSz w:w="11906" w:h="16838"/>
       <w:pgMar w:top="1418" w:right="851" w:bottom="1134" w:left="1418" w:header="720" w:footer="720" w:gutter="0"/>
       <w:cols w:space="720"/>

</xml_diff>

<commit_message>
basic-pitch via Python 3.10, fix playback, load test.mp3, fast settings
- basic-pitch (Spotify): runs via Python 3.10 subprocess (python310ENV/)
- BasicPitchDetector: subprocess wrapper with JSON communication
- Settings dialog: fast check (file exists, no subprocess on open)
- Fix: set_piece() after part delete/detect (playback stays in sync)
- test.mp3: first 10s of Bella figlia, auto-loaded on startup
- Audio import start dir: media/mp3
- python310ENV excluded from git

Co-Authored-By: Claude Opus 4.6 (1M context) <noreply@anthropic.com>
</commit_message>
<xml_diff>
--- a/MusiAI.docx
+++ b/MusiAI.docx
@@ -934,13 +934,18 @@
         <w:t xml:space="preserve"> </w:t>
       </w:r>
       <w:r>
-        <w:t xml:space="preserve">tempo ganz genau definieren kann? so wie bei einer live </w:t>
+        <w:t xml:space="preserve">tempo ganz genau definieren kann? so wie bei einer </w:t>
+      </w:r>
+      <w:proofErr w:type="gramStart"/>
+      <w:r>
+        <w:t xml:space="preserve">live </w:t>
       </w:r>
       <w:proofErr w:type="spellStart"/>
       <w:r>
         <w:t>performance</w:t>
       </w:r>
       <w:proofErr w:type="spellEnd"/>
+      <w:proofErr w:type="gramEnd"/>
       <w:r>
         <w:t>?</w:t>
       </w:r>
@@ -1655,7 +1660,35 @@
         <w:rPr>
           <w:rFonts w:cs="Arial"/>
         </w:rPr>
-        <w:t xml:space="preserve">  │ Audio (WAV/FLAC)         │ Erfasst alles 1:1, aber nicht editierbar wie MIDI    │</w:t>
+        <w:t xml:space="preserve">  │ Audio (WAV/</w:t>
+      </w:r>
+      <w:proofErr w:type="gramStart"/>
+      <w:r>
+        <w:rPr>
+          <w:rFonts w:cs="Arial"/>
+        </w:rPr>
+        <w:t xml:space="preserve">FLAC)   </w:t>
+      </w:r>
+      <w:proofErr w:type="gramEnd"/>
+      <w:r>
+        <w:rPr>
+          <w:rFonts w:cs="Arial"/>
+        </w:rPr>
+        <w:t xml:space="preserve">      │ </w:t>
+      </w:r>
+      <w:proofErr w:type="gramStart"/>
+      <w:r>
+        <w:rPr>
+          <w:rFonts w:cs="Arial"/>
+        </w:rPr>
+        <w:t>Erfasst</w:t>
+      </w:r>
+      <w:proofErr w:type="gramEnd"/>
+      <w:r>
+        <w:rPr>
+          <w:rFonts w:cs="Arial"/>
+        </w:rPr>
+        <w:t xml:space="preserve"> alles 1:1, aber nicht editierbar wie MIDI    │</w:t>
       </w:r>
     </w:p>
     <w:p>
@@ -1794,7 +1827,21 @@
         <w:rPr>
           <w:rFonts w:cs="Arial"/>
         </w:rPr>
-        <w:t xml:space="preserve">  Arbeitest du an einem konkreten Projekt, bei dem du sowas einbauen möchtest?</w:t>
+        <w:t xml:space="preserve">  </w:t>
+      </w:r>
+      <w:proofErr w:type="gramStart"/>
+      <w:r>
+        <w:rPr>
+          <w:rFonts w:cs="Arial"/>
+        </w:rPr>
+        <w:t>Arbeitest</w:t>
+      </w:r>
+      <w:proofErr w:type="gramEnd"/>
+      <w:r>
+        <w:rPr>
+          <w:rFonts w:cs="Arial"/>
+        </w:rPr>
+        <w:t xml:space="preserve"> du an einem konkreten Projekt, bei dem du sowas einbauen möchtest?</w:t>
       </w:r>
     </w:p>
     <w:p>
@@ -1936,7 +1983,21 @@
         <w:rPr>
           <w:rFonts w:cs="Arial"/>
         </w:rPr>
-        <w:t xml:space="preserve">  &lt;!-- Normales C4 --&gt;</w:t>
+        <w:t xml:space="preserve">  </w:t>
+      </w:r>
+      <w:proofErr w:type="gramStart"/>
+      <w:r>
+        <w:rPr>
+          <w:rFonts w:cs="Arial"/>
+        </w:rPr>
+        <w:t>&lt;!--</w:t>
+      </w:r>
+      <w:proofErr w:type="gramEnd"/>
+      <w:r>
+        <w:rPr>
+          <w:rFonts w:cs="Arial"/>
+        </w:rPr>
+        <w:t xml:space="preserve"> Normales C4 --&gt;</w:t>
       </w:r>
     </w:p>
     <w:p>
@@ -2092,7 +2153,21 @@
         <w:rPr>
           <w:rFonts w:cs="Arial"/>
         </w:rPr>
-        <w:t xml:space="preserve">  &lt;!-- C4, 4 Cent höher (4% eines Halbtons) --&gt;</w:t>
+        <w:t xml:space="preserve">  </w:t>
+      </w:r>
+      <w:proofErr w:type="gramStart"/>
+      <w:r>
+        <w:rPr>
+          <w:rFonts w:cs="Arial"/>
+        </w:rPr>
+        <w:t>&lt;!--</w:t>
+      </w:r>
+      <w:proofErr w:type="gramEnd"/>
+      <w:r>
+        <w:rPr>
+          <w:rFonts w:cs="Arial"/>
+        </w:rPr>
+        <w:t xml:space="preserve"> C4, 4 Cent höher (4% eines Halbtons) --&gt;</w:t>
       </w:r>
     </w:p>
     <w:p>
@@ -2165,7 +2240,21 @@
         <w:rPr>
           <w:rFonts w:cs="Arial"/>
         </w:rPr>
-        <w:t xml:space="preserve">    &lt;alter&gt;0.04&lt;/alter&gt;       &lt;!-- 0.04 Halbtöne = 4 Cent --&gt;</w:t>
+        <w:t xml:space="preserve">    &lt;alter&gt;0.04&lt;/alter&gt;       </w:t>
+      </w:r>
+      <w:proofErr w:type="gramStart"/>
+      <w:r>
+        <w:rPr>
+          <w:rFonts w:cs="Arial"/>
+        </w:rPr>
+        <w:t>&lt;!--</w:t>
+      </w:r>
+      <w:proofErr w:type="gramEnd"/>
+      <w:r>
+        <w:rPr>
+          <w:rFonts w:cs="Arial"/>
+        </w:rPr>
+        <w:t xml:space="preserve"> 0.04 Halbtöne = 4 Cent --&gt;</w:t>
       </w:r>
     </w:p>
     <w:p>
@@ -2247,7 +2336,21 @@
         <w:rPr>
           <w:rFonts w:cs="Arial"/>
         </w:rPr>
-        <w:t xml:space="preserve">  &lt;!-- C4, 40 Cent höher (fast ein Viertelton) --&gt;</w:t>
+        <w:t xml:space="preserve">  </w:t>
+      </w:r>
+      <w:proofErr w:type="gramStart"/>
+      <w:r>
+        <w:rPr>
+          <w:rFonts w:cs="Arial"/>
+        </w:rPr>
+        <w:t>&lt;!--</w:t>
+      </w:r>
+      <w:proofErr w:type="gramEnd"/>
+      <w:r>
+        <w:rPr>
+          <w:rFonts w:cs="Arial"/>
+        </w:rPr>
+        <w:t xml:space="preserve"> C4, 40 Cent höher (fast ein Viertelton) --&gt;</w:t>
       </w:r>
     </w:p>
     <w:p>
@@ -2652,7 +2755,21 @@
         <w:rPr>
           <w:rFonts w:cs="Arial"/>
         </w:rPr>
-        <w:t>&gt;     &lt;!-- 4 Ticks = Viertelnote --&gt;</w:t>
+        <w:t xml:space="preserve">&gt;     </w:t>
+      </w:r>
+      <w:proofErr w:type="gramStart"/>
+      <w:r>
+        <w:rPr>
+          <w:rFonts w:cs="Arial"/>
+        </w:rPr>
+        <w:t>&lt;!--</w:t>
+      </w:r>
+      <w:proofErr w:type="gramEnd"/>
+      <w:r>
+        <w:rPr>
+          <w:rFonts w:cs="Arial"/>
+        </w:rPr>
+        <w:t xml:space="preserve"> 4 Ticks = Viertelnote --&gt;</w:t>
       </w:r>
     </w:p>
     <w:p>
@@ -2695,7 +2812,21 @@
         <w:rPr>
           <w:rFonts w:cs="Arial"/>
         </w:rPr>
-        <w:t>&gt;       &lt;!-- genau eine Viertelnote --&gt;</w:t>
+        <w:t xml:space="preserve">&gt;       </w:t>
+      </w:r>
+      <w:proofErr w:type="gramStart"/>
+      <w:r>
+        <w:rPr>
+          <w:rFonts w:cs="Arial"/>
+        </w:rPr>
+        <w:t>&lt;!--</w:t>
+      </w:r>
+      <w:proofErr w:type="gramEnd"/>
+      <w:r>
+        <w:rPr>
+          <w:rFonts w:cs="Arial"/>
+        </w:rPr>
+        <w:t xml:space="preserve"> genau eine Viertelnote --&gt;</w:t>
       </w:r>
     </w:p>
     <w:p>
@@ -2738,7 +2869,21 @@
         <w:rPr>
           <w:rFonts w:cs="Arial"/>
         </w:rPr>
-        <w:t>&gt;       &lt;!-- 25% länger - viel zu viel! --&gt;</w:t>
+        <w:t xml:space="preserve">&gt;       </w:t>
+      </w:r>
+      <w:proofErr w:type="gramStart"/>
+      <w:r>
+        <w:rPr>
+          <w:rFonts w:cs="Arial"/>
+        </w:rPr>
+        <w:t>&lt;!--</w:t>
+      </w:r>
+      <w:proofErr w:type="gramEnd"/>
+      <w:r>
+        <w:rPr>
+          <w:rFonts w:cs="Arial"/>
+        </w:rPr>
+        <w:t xml:space="preserve"> 25% länger - viel zu viel! --&gt;</w:t>
       </w:r>
     </w:p>
     <w:p>
@@ -2866,31 +3011,59 @@
         <w:rPr>
           <w:rFonts w:cs="Arial"/>
         </w:rPr>
-        <w:t>&gt;   &lt;!-- 480 Ticks = eine Viertelnote (DAW-üblich!) --&gt;</w:t>
-      </w:r>
-    </w:p>
-    <w:p>
-      <w:pPr>
-        <w:pStyle w:val="Textkrper2"/>
-        <w:ind w:left="0"/>
-        <w:rPr>
-          <w:rFonts w:cs="Arial"/>
-        </w:rPr>
-      </w:pPr>
-    </w:p>
-    <w:p>
-      <w:pPr>
-        <w:pStyle w:val="Textkrper2"/>
-        <w:ind w:left="0"/>
-        <w:rPr>
-          <w:rFonts w:cs="Arial"/>
-        </w:rPr>
-      </w:pPr>
-      <w:r>
-        <w:rPr>
-          <w:rFonts w:cs="Arial"/>
-        </w:rPr>
-        <w:t xml:space="preserve">  &lt;!-- Exakte Viertelnote --&gt;</w:t>
+        <w:t xml:space="preserve">&gt;   </w:t>
+      </w:r>
+      <w:proofErr w:type="gramStart"/>
+      <w:r>
+        <w:rPr>
+          <w:rFonts w:cs="Arial"/>
+        </w:rPr>
+        <w:t>&lt;!--</w:t>
+      </w:r>
+      <w:proofErr w:type="gramEnd"/>
+      <w:r>
+        <w:rPr>
+          <w:rFonts w:cs="Arial"/>
+        </w:rPr>
+        <w:t xml:space="preserve"> 480 Ticks = eine Viertelnote (DAW-üblich!) --&gt;</w:t>
+      </w:r>
+    </w:p>
+    <w:p>
+      <w:pPr>
+        <w:pStyle w:val="Textkrper2"/>
+        <w:ind w:left="0"/>
+        <w:rPr>
+          <w:rFonts w:cs="Arial"/>
+        </w:rPr>
+      </w:pPr>
+    </w:p>
+    <w:p>
+      <w:pPr>
+        <w:pStyle w:val="Textkrper2"/>
+        <w:ind w:left="0"/>
+        <w:rPr>
+          <w:rFonts w:cs="Arial"/>
+        </w:rPr>
+      </w:pPr>
+      <w:r>
+        <w:rPr>
+          <w:rFonts w:cs="Arial"/>
+        </w:rPr>
+        <w:t xml:space="preserve">  </w:t>
+      </w:r>
+      <w:proofErr w:type="gramStart"/>
+      <w:r>
+        <w:rPr>
+          <w:rFonts w:cs="Arial"/>
+        </w:rPr>
+        <w:t>&lt;!--</w:t>
+      </w:r>
+      <w:proofErr w:type="gramEnd"/>
+      <w:r>
+        <w:rPr>
+          <w:rFonts w:cs="Arial"/>
+        </w:rPr>
+        <w:t xml:space="preserve"> Exakte Viertelnote --&gt;</w:t>
       </w:r>
     </w:p>
     <w:p>
@@ -2957,7 +3130,21 @@
         <w:rPr>
           <w:rFonts w:cs="Arial"/>
         </w:rPr>
-        <w:t xml:space="preserve">  &lt;!-- 1% länger --&gt;</w:t>
+        <w:t xml:space="preserve">  </w:t>
+      </w:r>
+      <w:proofErr w:type="gramStart"/>
+      <w:r>
+        <w:rPr>
+          <w:rFonts w:cs="Arial"/>
+        </w:rPr>
+        <w:t>&lt;!--</w:t>
+      </w:r>
+      <w:proofErr w:type="gramEnd"/>
+      <w:r>
+        <w:rPr>
+          <w:rFonts w:cs="Arial"/>
+        </w:rPr>
+        <w:t xml:space="preserve"> 1% länger --&gt;</w:t>
       </w:r>
     </w:p>
     <w:p>
@@ -3000,31 +3187,59 @@
         <w:rPr>
           <w:rFonts w:cs="Arial"/>
         </w:rPr>
-        <w:t>&gt;     &lt;!-- 480 × 1.01 = 484.8 ≈ 485 --&gt;</w:t>
-      </w:r>
-    </w:p>
-    <w:p>
-      <w:pPr>
-        <w:pStyle w:val="Textkrper2"/>
-        <w:ind w:left="0"/>
-        <w:rPr>
-          <w:rFonts w:cs="Arial"/>
-        </w:rPr>
-      </w:pPr>
-    </w:p>
-    <w:p>
-      <w:pPr>
-        <w:pStyle w:val="Textkrper2"/>
-        <w:ind w:left="0"/>
-        <w:rPr>
-          <w:rFonts w:cs="Arial"/>
-        </w:rPr>
-      </w:pPr>
-      <w:r>
-        <w:rPr>
-          <w:rFonts w:cs="Arial"/>
-        </w:rPr>
-        <w:t xml:space="preserve">  &lt;!-- 5% länger --&gt;</w:t>
+        <w:t xml:space="preserve">&gt;     </w:t>
+      </w:r>
+      <w:proofErr w:type="gramStart"/>
+      <w:r>
+        <w:rPr>
+          <w:rFonts w:cs="Arial"/>
+        </w:rPr>
+        <w:t>&lt;!--</w:t>
+      </w:r>
+      <w:proofErr w:type="gramEnd"/>
+      <w:r>
+        <w:rPr>
+          <w:rFonts w:cs="Arial"/>
+        </w:rPr>
+        <w:t xml:space="preserve"> 480 × 1.01 = 484.8 ≈ 485 --&gt;</w:t>
+      </w:r>
+    </w:p>
+    <w:p>
+      <w:pPr>
+        <w:pStyle w:val="Textkrper2"/>
+        <w:ind w:left="0"/>
+        <w:rPr>
+          <w:rFonts w:cs="Arial"/>
+        </w:rPr>
+      </w:pPr>
+    </w:p>
+    <w:p>
+      <w:pPr>
+        <w:pStyle w:val="Textkrper2"/>
+        <w:ind w:left="0"/>
+        <w:rPr>
+          <w:rFonts w:cs="Arial"/>
+        </w:rPr>
+      </w:pPr>
+      <w:r>
+        <w:rPr>
+          <w:rFonts w:cs="Arial"/>
+        </w:rPr>
+        <w:t xml:space="preserve">  </w:t>
+      </w:r>
+      <w:proofErr w:type="gramStart"/>
+      <w:r>
+        <w:rPr>
+          <w:rFonts w:cs="Arial"/>
+        </w:rPr>
+        <w:t>&lt;!--</w:t>
+      </w:r>
+      <w:proofErr w:type="gramEnd"/>
+      <w:r>
+        <w:rPr>
+          <w:rFonts w:cs="Arial"/>
+        </w:rPr>
+        <w:t xml:space="preserve"> 5% länger --&gt;</w:t>
       </w:r>
     </w:p>
     <w:p>
@@ -3067,31 +3282,59 @@
         <w:rPr>
           <w:rFonts w:cs="Arial"/>
         </w:rPr>
-        <w:t>&gt;     &lt;!-- 480 × 1.05 = 504 --&gt;</w:t>
-      </w:r>
-    </w:p>
-    <w:p>
-      <w:pPr>
-        <w:pStyle w:val="Textkrper2"/>
-        <w:ind w:left="0"/>
-        <w:rPr>
-          <w:rFonts w:cs="Arial"/>
-        </w:rPr>
-      </w:pPr>
-    </w:p>
-    <w:p>
-      <w:pPr>
-        <w:pStyle w:val="Textkrper2"/>
-        <w:ind w:left="0"/>
-        <w:rPr>
-          <w:rFonts w:cs="Arial"/>
-        </w:rPr>
-      </w:pPr>
-      <w:r>
-        <w:rPr>
-          <w:rFonts w:cs="Arial"/>
-        </w:rPr>
-        <w:t xml:space="preserve">  &lt;!-- 0.5% länger --&gt;</w:t>
+        <w:t xml:space="preserve">&gt;     </w:t>
+      </w:r>
+      <w:proofErr w:type="gramStart"/>
+      <w:r>
+        <w:rPr>
+          <w:rFonts w:cs="Arial"/>
+        </w:rPr>
+        <w:t>&lt;!--</w:t>
+      </w:r>
+      <w:proofErr w:type="gramEnd"/>
+      <w:r>
+        <w:rPr>
+          <w:rFonts w:cs="Arial"/>
+        </w:rPr>
+        <w:t xml:space="preserve"> 480 × 1.05 = 504 --&gt;</w:t>
+      </w:r>
+    </w:p>
+    <w:p>
+      <w:pPr>
+        <w:pStyle w:val="Textkrper2"/>
+        <w:ind w:left="0"/>
+        <w:rPr>
+          <w:rFonts w:cs="Arial"/>
+        </w:rPr>
+      </w:pPr>
+    </w:p>
+    <w:p>
+      <w:pPr>
+        <w:pStyle w:val="Textkrper2"/>
+        <w:ind w:left="0"/>
+        <w:rPr>
+          <w:rFonts w:cs="Arial"/>
+        </w:rPr>
+      </w:pPr>
+      <w:r>
+        <w:rPr>
+          <w:rFonts w:cs="Arial"/>
+        </w:rPr>
+        <w:t xml:space="preserve">  </w:t>
+      </w:r>
+      <w:proofErr w:type="gramStart"/>
+      <w:r>
+        <w:rPr>
+          <w:rFonts w:cs="Arial"/>
+        </w:rPr>
+        <w:t>&lt;!--</w:t>
+      </w:r>
+      <w:proofErr w:type="gramEnd"/>
+      <w:r>
+        <w:rPr>
+          <w:rFonts w:cs="Arial"/>
+        </w:rPr>
+        <w:t xml:space="preserve"> 0.5% länger --&gt;</w:t>
       </w:r>
     </w:p>
     <w:p>
@@ -3134,7 +3377,21 @@
         <w:rPr>
           <w:rFonts w:cs="Arial"/>
         </w:rPr>
-        <w:t>&gt;     &lt;!-- 480 × 1.005 = 482.4 ≈ 482 --&gt;</w:t>
+        <w:t xml:space="preserve">&gt;     </w:t>
+      </w:r>
+      <w:proofErr w:type="gramStart"/>
+      <w:r>
+        <w:rPr>
+          <w:rFonts w:cs="Arial"/>
+        </w:rPr>
+        <w:t>&lt;!--</w:t>
+      </w:r>
+      <w:proofErr w:type="gramEnd"/>
+      <w:r>
+        <w:rPr>
+          <w:rFonts w:cs="Arial"/>
+        </w:rPr>
+        <w:t xml:space="preserve"> 480 × 1.005 = 482.4 ≈ 482 --&gt;</w:t>
       </w:r>
     </w:p>
     <w:p>
@@ -3351,7 +3608,21 @@
         <w:rPr>
           <w:rFonts w:cs="Arial"/>
         </w:rPr>
-        <w:t>● Write(Recherche\</w:t>
+        <w:t xml:space="preserve">● </w:t>
+      </w:r>
+      <w:proofErr w:type="gramStart"/>
+      <w:r>
+        <w:rPr>
+          <w:rFonts w:cs="Arial"/>
+        </w:rPr>
+        <w:t>Write(</w:t>
+      </w:r>
+      <w:proofErr w:type="gramEnd"/>
+      <w:r>
+        <w:rPr>
+          <w:rFonts w:cs="Arial"/>
+        </w:rPr>
+        <w:t>Recherche\</w:t>
       </w:r>
       <w:proofErr w:type="spellStart"/>
       <w:r>
@@ -3382,6 +3653,7 @@
         </w:rPr>
         <w:t xml:space="preserve">  </w:t>
       </w:r>
+      <w:proofErr w:type="gramStart"/>
       <w:r>
         <w:rPr>
           <w:rFonts w:ascii="Cambria Math" w:hAnsi="Cambria Math" w:cs="Cambria Math"/>
@@ -3402,6 +3674,7 @@
         <w:t>Wrote</w:t>
       </w:r>
       <w:proofErr w:type="spellEnd"/>
+      <w:proofErr w:type="gramEnd"/>
       <w:r>
         <w:rPr>
           <w:rFonts w:cs="Arial"/>
@@ -3600,7 +3873,21 @@
         <w:rPr>
           <w:rFonts w:cs="Arial"/>
         </w:rPr>
-        <w:t xml:space="preserve">       4 &lt;!--</w:t>
+        <w:t xml:space="preserve">       4 </w:t>
+      </w:r>
+      <w:proofErr w:type="gramStart"/>
+      <w:r>
+        <w:rPr>
+          <w:rFonts w:cs="Arial"/>
+        </w:rPr>
+        <w:t>&lt;!-</w:t>
+      </w:r>
+      <w:proofErr w:type="gramEnd"/>
+      <w:r>
+        <w:rPr>
+          <w:rFonts w:cs="Arial"/>
+        </w:rPr>
+        <w:t>-</w:t>
       </w:r>
     </w:p>
     <w:p>
@@ -4051,13 +4338,27 @@
         <w:rPr>
           <w:rFonts w:cs="Arial"/>
         </w:rPr>
-        <w:t xml:space="preserve">(um ein paar Cent) </w:t>
-      </w:r>
-      <w:r>
-        <w:rPr>
-          <w:rFonts w:cs="Arial"/>
-        </w:rPr>
-        <w:t>, z.B. durch Midi Keyboard</w:t>
+        <w:t>(um ein paar Cent</w:t>
+      </w:r>
+      <w:proofErr w:type="gramStart"/>
+      <w:r>
+        <w:rPr>
+          <w:rFonts w:cs="Arial"/>
+        </w:rPr>
+        <w:t xml:space="preserve">) </w:t>
+      </w:r>
+      <w:r>
+        <w:rPr>
+          <w:rFonts w:cs="Arial"/>
+        </w:rPr>
+        <w:t>,</w:t>
+      </w:r>
+      <w:proofErr w:type="gramEnd"/>
+      <w:r>
+        <w:rPr>
+          <w:rFonts w:cs="Arial"/>
+        </w:rPr>
+        <w:t xml:space="preserve"> z.B. durch Midi Keyboard</w:t>
       </w:r>
     </w:p>
     <w:p>
@@ -5509,7 +5810,35 @@
         <w:rPr>
           <w:rFonts w:cs="Arial"/>
         </w:rPr>
-        <w:t xml:space="preserve">meinem UI möchte ich Farbwerte nach Lautstärke. Default : Rot, leiser= Farbskale rot-gelb, lauter= Farbskala bis  Blau. Die Länge der </w:t>
+        <w:t xml:space="preserve">meinem UI möchte ich Farbwerte nach Lautstärke. </w:t>
+      </w:r>
+      <w:proofErr w:type="gramStart"/>
+      <w:r>
+        <w:rPr>
+          <w:rFonts w:cs="Arial"/>
+        </w:rPr>
+        <w:t>Default :</w:t>
+      </w:r>
+      <w:proofErr w:type="gramEnd"/>
+      <w:r>
+        <w:rPr>
+          <w:rFonts w:cs="Arial"/>
+        </w:rPr>
+        <w:t xml:space="preserve"> Rot, leiser= Farbskale rot-gelb, lauter= Farbskala </w:t>
+      </w:r>
+      <w:proofErr w:type="gramStart"/>
+      <w:r>
+        <w:rPr>
+          <w:rFonts w:cs="Arial"/>
+        </w:rPr>
+        <w:t>bis  Blau</w:t>
+      </w:r>
+      <w:proofErr w:type="gramEnd"/>
+      <w:r>
+        <w:rPr>
+          <w:rFonts w:cs="Arial"/>
+        </w:rPr>
+        <w:t xml:space="preserve">. Die Länge der </w:t>
       </w:r>
       <w:proofErr w:type="spellStart"/>
       <w:r>
@@ -5537,7 +5866,21 @@
         <w:rPr>
           <w:rFonts w:cs="Arial"/>
         </w:rPr>
-        <w:t xml:space="preserve"> des Taktes, z.B. doppelt so lang wenn der Takt länger ist.  wenn es Tonverschiebungen gibt, soll es die </w:t>
+        <w:t xml:space="preserve"> des Taktes, z.B. doppelt so </w:t>
+      </w:r>
+      <w:proofErr w:type="gramStart"/>
+      <w:r>
+        <w:rPr>
+          <w:rFonts w:cs="Arial"/>
+        </w:rPr>
+        <w:t>lang</w:t>
+      </w:r>
+      <w:proofErr w:type="gramEnd"/>
+      <w:r>
+        <w:rPr>
+          <w:rFonts w:cs="Arial"/>
+        </w:rPr>
+        <w:t xml:space="preserve"> wenn der Takt länger ist.  wenn es Tonverschiebungen gibt, soll es die </w:t>
       </w:r>
       <w:proofErr w:type="spellStart"/>
       <w:r>
@@ -5591,7 +5934,14 @@
         <w:rPr>
           <w:rFonts w:cs="Arial"/>
         </w:rPr>
-        <w:t xml:space="preserve">, kreis nach unten/oben falls die Verschiebung gleitend ist. Falls die Notenlänge innerhalb eines  </w:t>
+        <w:t xml:space="preserve">, kreis nach unten/oben falls die Verschiebung gleitend ist. Falls die Notenlänge innerhalb </w:t>
+      </w:r>
+      <w:proofErr w:type="gramStart"/>
+      <w:r>
+        <w:rPr>
+          <w:rFonts w:cs="Arial"/>
+        </w:rPr>
+        <w:t xml:space="preserve">eines  </w:t>
       </w:r>
       <w:proofErr w:type="spellStart"/>
       <w:r>
@@ -5601,6 +5951,7 @@
         <w:t>taktes</w:t>
       </w:r>
       <w:proofErr w:type="spellEnd"/>
+      <w:proofErr w:type="gramEnd"/>
       <w:r>
         <w:rPr>
           <w:rFonts w:cs="Arial"/>
@@ -5675,7 +6026,35 @@
         <w:rPr>
           <w:rFonts w:cs="Arial"/>
         </w:rPr>
-        <w:t xml:space="preserve"> möchte ich erstmal die  basislänge der Takte mit Keyboard eingeben können. Die Länge der Noten / Lautstärke eines bestehenden Midi Sheets  während des </w:t>
+        <w:t xml:space="preserve"> möchte ich erstmal </w:t>
+      </w:r>
+      <w:proofErr w:type="gramStart"/>
+      <w:r>
+        <w:rPr>
+          <w:rFonts w:cs="Arial"/>
+        </w:rPr>
+        <w:t>die  basislänge</w:t>
+      </w:r>
+      <w:proofErr w:type="gramEnd"/>
+      <w:r>
+        <w:rPr>
+          <w:rFonts w:cs="Arial"/>
+        </w:rPr>
+        <w:t xml:space="preserve"> der Takte mit Keyboard eingeben können. Die Länge der Noten / Lautstärke eines bestehenden Midi </w:t>
+      </w:r>
+      <w:proofErr w:type="gramStart"/>
+      <w:r>
+        <w:rPr>
+          <w:rFonts w:cs="Arial"/>
+        </w:rPr>
+        <w:t>Sheets  während</w:t>
+      </w:r>
+      <w:proofErr w:type="gramEnd"/>
+      <w:r>
+        <w:rPr>
+          <w:rFonts w:cs="Arial"/>
+        </w:rPr>
+        <w:t xml:space="preserve"> des </w:t>
       </w:r>
       <w:proofErr w:type="spellStart"/>
       <w:r>
@@ -5703,7 +6082,21 @@
         <w:rPr>
           <w:rFonts w:cs="Arial"/>
         </w:rPr>
-        <w:t xml:space="preserve">. z.B. das Midi spielt ab, ich setzte auf dem Keyboard die Lautstärke, das wird  dann gesetzt im </w:t>
+        <w:t xml:space="preserve">. z.B. das Midi spielt ab, ich setzte auf dem Keyboard die Lautstärke, das </w:t>
+      </w:r>
+      <w:proofErr w:type="gramStart"/>
+      <w:r>
+        <w:rPr>
+          <w:rFonts w:cs="Arial"/>
+        </w:rPr>
+        <w:t>wird  dann</w:t>
+      </w:r>
+      <w:proofErr w:type="gramEnd"/>
+      <w:r>
+        <w:rPr>
+          <w:rFonts w:cs="Arial"/>
+        </w:rPr>
+        <w:t xml:space="preserve"> gesetzt im </w:t>
       </w:r>
       <w:proofErr w:type="spellStart"/>
       <w:r>
@@ -5745,7 +6138,21 @@
         <w:rPr>
           <w:rFonts w:cs="Arial"/>
         </w:rPr>
-        <w:t xml:space="preserve"> durch eine Taste, die zacken werden gesetzt.  ich brauche noch: Noten verschieben, lösche, die Farben der Noten / Linien ändern (also Länge der Note, Lautstärke)  , die Zacken ändern. wie realistisch ist das?</w:t>
+        <w:t xml:space="preserve"> durch eine Taste, die zacken werden gesetzt.  ich brauche noch: Noten verschieben, lösche, die Farben der Noten / Linien ändern (also Länge der Note, </w:t>
+      </w:r>
+      <w:proofErr w:type="gramStart"/>
+      <w:r>
+        <w:rPr>
+          <w:rFonts w:cs="Arial"/>
+        </w:rPr>
+        <w:t>Lautstärke)  ,</w:t>
+      </w:r>
+      <w:proofErr w:type="gramEnd"/>
+      <w:r>
+        <w:rPr>
+          <w:rFonts w:cs="Arial"/>
+        </w:rPr>
+        <w:t xml:space="preserve"> die Zacken ändern. wie realistisch ist das?</w:t>
       </w:r>
     </w:p>
     <w:p>
@@ -5912,7 +6319,15 @@
         <w:ind w:left="0"/>
       </w:pPr>
       <w:r>
-        <w:t xml:space="preserve">  Takt 1 (kurz)          Takt 2 (doppelt so lang)</w:t>
+        <w:t xml:space="preserve">  Takt 1 (</w:t>
+      </w:r>
+      <w:proofErr w:type="gramStart"/>
+      <w:r>
+        <w:t xml:space="preserve">kurz)   </w:t>
+      </w:r>
+      <w:proofErr w:type="gramEnd"/>
+      <w:r>
+        <w:t xml:space="preserve">       Takt 2 (doppelt so lang)</w:t>
       </w:r>
     </w:p>
     <w:p>
@@ -5969,7 +6384,15 @@
         <w:ind w:left="0"/>
       </w:pPr>
       <w:r>
-        <w:t xml:space="preserve">  Cent hoch (Zacke):      ●───/\───●    (spitze Zacke = sofort)</w:t>
+        <w:t xml:space="preserve">  Cent hoch (Zacke):      ●───/\───● </w:t>
+      </w:r>
+      <w:proofErr w:type="gramStart"/>
+      <w:r>
+        <w:t xml:space="preserve">   (</w:t>
+      </w:r>
+      <w:proofErr w:type="gramEnd"/>
+      <w:r>
+        <w:t>spitze Zacke = sofort)</w:t>
       </w:r>
     </w:p>
     <w:p>
@@ -6008,7 +6431,15 @@
         <w:t>────●</w:t>
       </w:r>
       <w:r>
-        <w:t xml:space="preserve">    (Bogen = Glissando)</w:t>
+        <w:t xml:space="preserve"> </w:t>
+      </w:r>
+      <w:proofErr w:type="gramStart"/>
+      <w:r>
+        <w:t xml:space="preserve">   (</w:t>
+      </w:r>
+      <w:proofErr w:type="gramEnd"/>
+      <w:r>
+        <w:t>Bogen = Glissando)</w:t>
       </w:r>
     </w:p>
     <w:p>
@@ -6053,7 +6484,15 @@
         <w:ind w:left="0"/>
       </w:pPr>
       <w:r>
-        <w:t xml:space="preserve">                          ●─══●══──●    (═ = gelb-rot gefärbt)</w:t>
+        <w:t xml:space="preserve">                          ●─══●══──● </w:t>
+      </w:r>
+      <w:proofErr w:type="gramStart"/>
+      <w:r>
+        <w:t xml:space="preserve">   (</w:t>
+      </w:r>
+      <w:proofErr w:type="gramEnd"/>
+      <w:r>
+        <w:t>═ = gelb-rot gefärbt)</w:t>
       </w:r>
     </w:p>
     <w:p>
@@ -6077,7 +6516,15 @@
         <w:ind w:left="0"/>
       </w:pPr>
       <w:r>
-        <w:t xml:space="preserve">                          ●─══●══──●    (═ = blau gefärbt)</w:t>
+        <w:t xml:space="preserve">                          ●─══●══──● </w:t>
+      </w:r>
+      <w:proofErr w:type="gramStart"/>
+      <w:r>
+        <w:t xml:space="preserve">   (</w:t>
+      </w:r>
+      <w:proofErr w:type="gramEnd"/>
+      <w:r>
+        <w:t>═ = blau gefärbt)</w:t>
       </w:r>
     </w:p>
     <w:p>
@@ -6189,7 +6636,15 @@
         <w:ind w:left="0"/>
       </w:pPr>
       <w:r>
-        <w:t xml:space="preserve">  │ Farbe nach Velocity (rot-gelb-blau)           │ 2 Stunden        │    Einfach    │</w:t>
+        <w:t xml:space="preserve">  │ Farbe nach Velocity (rot-gelb-</w:t>
+      </w:r>
+      <w:proofErr w:type="gramStart"/>
+      <w:r>
+        <w:t xml:space="preserve">blau)   </w:t>
+      </w:r>
+      <w:proofErr w:type="gramEnd"/>
+      <w:r>
+        <w:t xml:space="preserve">        │ 2 Stunden        │    Einfach    │</w:t>
       </w:r>
     </w:p>
     <w:p>
@@ -6264,12 +6719,17 @@
         <w:t xml:space="preserve">  │ Abspielen (</w:t>
       </w:r>
       <w:proofErr w:type="spellStart"/>
+      <w:proofErr w:type="gramStart"/>
       <w:r>
         <w:t>fluidsynth</w:t>
       </w:r>
       <w:proofErr w:type="spellEnd"/>
       <w:r>
-        <w:t>)                        │ 0.5 Tage         │    Einfach    │</w:t>
+        <w:t xml:space="preserve">)   </w:t>
+      </w:r>
+      <w:proofErr w:type="gramEnd"/>
+      <w:r>
+        <w:t xml:space="preserve">                     │ 0.5 Tage         │    Einfach    │</w:t>
       </w:r>
     </w:p>
     <w:p>
@@ -6342,7 +6802,15 @@
         <w:ind w:left="0"/>
       </w:pPr>
       <w:r>
-        <w:t xml:space="preserve">  │ Note verschieben (Drag)                       │ 1 Tag            │    Mittel     │</w:t>
+        <w:t xml:space="preserve">  │ Note verschieben (</w:t>
+      </w:r>
+      <w:proofErr w:type="gramStart"/>
+      <w:r>
+        <w:t xml:space="preserve">Drag)   </w:t>
+      </w:r>
+      <w:proofErr w:type="gramEnd"/>
+      <w:r>
+        <w:t xml:space="preserve">                    │ 1 Tag            │    Mittel     │</w:t>
       </w:r>
     </w:p>
     <w:p>
@@ -6414,7 +6882,15 @@
         <w:ind w:left="0"/>
       </w:pPr>
       <w:r>
-        <w:t xml:space="preserve">  │ Gesamt                                        │ ~7-8 Arbeitstage │               │</w:t>
+        <w:t xml:space="preserve">  │ </w:t>
+      </w:r>
+      <w:proofErr w:type="gramStart"/>
+      <w:r>
+        <w:t>Gesamt</w:t>
+      </w:r>
+      <w:proofErr w:type="gramEnd"/>
+      <w:r>
+        <w:t xml:space="preserve">                                        │ ~7-8 Arbeitstage │               │</w:t>
       </w:r>
     </w:p>
     <w:p>
@@ -6670,12 +7146,22 @@
         <w:t xml:space="preserve">  1. </w:t>
       </w:r>
       <w:proofErr w:type="spellStart"/>
+      <w:proofErr w:type="gramStart"/>
       <w:r>
         <w:t>piece.tempos</w:t>
       </w:r>
       <w:proofErr w:type="spellEnd"/>
-      <w:r>
-        <w:t>[0].bpm = Globales Tempo (z.B. 100 BPM)</w:t>
+      <w:proofErr w:type="gramEnd"/>
+      <w:r>
+        <w:t>[0</w:t>
+      </w:r>
+      <w:proofErr w:type="gramStart"/>
+      <w:r>
+        <w:t>].bpm</w:t>
+      </w:r>
+      <w:proofErr w:type="gramEnd"/>
+      <w:r>
+        <w:t xml:space="preserve"> = Globales Tempo (z.B. 100 BPM)</w:t>
       </w:r>
     </w:p>
     <w:p>
@@ -6712,8 +7198,13 @@
         <w:t xml:space="preserve">  3. Note hat KEIN eigenes Tempo - der Dauer-Slider ändert </w:t>
       </w:r>
       <w:proofErr w:type="spellStart"/>
-      <w:r>
-        <w:t>note.expression.duration_deviation</w:t>
+      <w:proofErr w:type="gramStart"/>
+      <w:r>
+        <w:t>note.expression</w:t>
+      </w:r>
+      <w:proofErr w:type="gramEnd"/>
+      <w:r>
+        <w:t>.duration_deviation</w:t>
       </w:r>
       <w:proofErr w:type="spellEnd"/>
       <w:r>
@@ -6748,7 +7239,15 @@
       </w:r>
       <w:proofErr w:type="spellEnd"/>
       <w:r>
-        <w:t xml:space="preserve"> wird ausgelöst wenn:</w:t>
+        <w:t xml:space="preserve"> wird </w:t>
+      </w:r>
+      <w:proofErr w:type="gramStart"/>
+      <w:r>
+        <w:t>ausgelöst</w:t>
+      </w:r>
+      <w:proofErr w:type="gramEnd"/>
+      <w:r>
+        <w:t xml:space="preserve"> wenn:</w:t>
       </w:r>
     </w:p>
     <w:p>
@@ -6850,6 +7349,35 @@
         <w:pStyle w:val="berschrift2"/>
       </w:pPr>
       <w:r>
+        <w:t>Notenerkennung</w:t>
+      </w:r>
+    </w:p>
+    <w:p>
+      <w:pPr>
+        <w:pStyle w:val="Textkrper2"/>
+        <w:ind w:left="0"/>
+      </w:pPr>
+      <w:proofErr w:type="spellStart"/>
+      <w:r>
+        <w:t>basic</w:t>
+      </w:r>
+      <w:proofErr w:type="spellEnd"/>
+      <w:r>
+        <w:t>-pitch 0.4</w:t>
+      </w:r>
+    </w:p>
+    <w:p>
+      <w:pPr>
+        <w:pStyle w:val="Textkrper2"/>
+        <w:ind w:left="0"/>
+      </w:pPr>
+    </w:p>
+    <w:p>
+      <w:pPr>
+        <w:pStyle w:val="berschrift2"/>
+      </w:pPr>
+      <w:r>
+        <w:lastRenderedPageBreak/>
         <w:t>Sounds</w:t>
       </w:r>
       <w:bookmarkEnd w:id="8"/>

</xml_diff>